<commit_message>
exposed isDriving flag in the AI training data collection script
</commit_message>
<xml_diff>
--- a/docs/Mister Mischief AI Training Data Collection SOP.docx
+++ b/docs/Mister Mischief AI Training Data Collection SOP.docx
@@ -23,738 +23,2124 @@
       </w:r>
     </w:p>
     <w:p>
+      <w:pPr>
+        <w:pStyle w:val="NormalWeb"/>
+        <w:jc w:val="both"/>
+        <w:rPr>
+          <w:rFonts w:eastAsia="Times New Roman"/>
+          <w:kern w:val="0"/>
+          <w14:ligatures w14:val="none"/>
+        </w:rPr>
+      </w:pPr>
       <w:r>
         <w:br/>
       </w:r>
       <w:r>
-        <w:t xml:space="preserve">Putting the robot into </w:t>
-      </w:r>
-      <w:proofErr w:type="spellStart"/>
-      <w:r>
-        <w:t>Mode_BrainDead</w:t>
-      </w:r>
-      <w:proofErr w:type="spellEnd"/>
-      <w:r>
-        <w:t xml:space="preserve"> first is the critical step. If you run the script while the Heuristic brain is still active, Mister Mischief will try to fight your hands and run away while you are trying to label the data, which will completely ruin your IMU and motor readings.</w:t>
+        <w:rPr>
+          <w:rFonts w:eastAsia="Times New Roman"/>
+          <w:kern w:val="0"/>
+          <w14:ligatures w14:val="none"/>
+        </w:rPr>
+        <w:t>Here is the exact, step-by-step Standard Operating Procedure (SOP) to guarantee mathematically pristine data collection using your new Python script.</w:t>
       </w:r>
     </w:p>
     <w:p>
-      <w:r>
-        <w:t>Here is the exact, step-by-step Standard Operating Procedure (SOP) you must follow to guarantee mathematically pristine data collection.</w:t>
+      <w:pPr>
+        <w:spacing w:before="100" w:beforeAutospacing="1" w:after="100" w:afterAutospacing="1" w:line="240" w:lineRule="auto"/>
+        <w:jc w:val="both"/>
+        <w:outlineLvl w:val="2"/>
+        <w:rPr>
+          <w:rFonts w:ascii="Times New Roman" w:eastAsia="Times New Roman" w:hAnsi="Times New Roman" w:cs="Times New Roman"/>
+          <w:b/>
+          <w:bCs/>
+          <w:kern w:val="0"/>
+          <w:sz w:val="27"/>
+          <w:szCs w:val="27"/>
+          <w14:ligatures w14:val="none"/>
+        </w:rPr>
+      </w:pPr>
+      <w:r>
+        <w:rPr>
+          <w:rFonts w:ascii="Times New Roman" w:eastAsia="Times New Roman" w:hAnsi="Times New Roman" w:cs="Times New Roman"/>
+          <w:b/>
+          <w:bCs/>
+          <w:kern w:val="0"/>
+          <w:sz w:val="27"/>
+          <w:szCs w:val="27"/>
+          <w14:ligatures w14:val="none"/>
+        </w:rPr>
+        <w:t>Mister Mischief 2-Layer AI Training Data Collection</w:t>
       </w:r>
     </w:p>
     <w:p>
       <w:pPr>
-        <w:rPr>
+        <w:spacing w:before="100" w:beforeAutospacing="1" w:after="100" w:afterAutospacing="1" w:line="240" w:lineRule="auto"/>
+        <w:jc w:val="both"/>
+        <w:outlineLvl w:val="3"/>
+        <w:rPr>
+          <w:rFonts w:ascii="Times New Roman" w:eastAsia="Times New Roman" w:hAnsi="Times New Roman" w:cs="Times New Roman"/>
           <w:b/>
           <w:bCs/>
-          <w:sz w:val="28"/>
-          <w:szCs w:val="28"/>
-        </w:rPr>
-      </w:pPr>
-      <w:r>
-        <w:rPr>
+          <w:kern w:val="0"/>
+          <w14:ligatures w14:val="none"/>
+        </w:rPr>
+      </w:pPr>
+      <w:r>
+        <w:rPr>
+          <w:rFonts w:ascii="Times New Roman" w:eastAsia="Times New Roman" w:hAnsi="Times New Roman" w:cs="Times New Roman"/>
           <w:b/>
           <w:bCs/>
-          <w:sz w:val="28"/>
-          <w:szCs w:val="28"/>
+          <w:kern w:val="0"/>
+          <w14:ligatures w14:val="none"/>
         </w:rPr>
         <w:t>Phase 1: The Setup</w:t>
       </w:r>
     </w:p>
     <w:p>
-      <w:r>
-        <w:rPr>
+      <w:pPr>
+        <w:numPr>
+          <w:ilvl w:val="0"/>
+          <w:numId w:val="5"/>
+        </w:numPr>
+        <w:spacing w:before="100" w:beforeAutospacing="1" w:after="100" w:afterAutospacing="1" w:line="240" w:lineRule="auto"/>
+        <w:jc w:val="both"/>
+        <w:rPr>
+          <w:rFonts w:ascii="Times New Roman" w:eastAsia="Times New Roman" w:hAnsi="Times New Roman" w:cs="Times New Roman"/>
+          <w:kern w:val="0"/>
+          <w14:ligatures w14:val="none"/>
+        </w:rPr>
+      </w:pPr>
+      <w:r>
+        <w:rPr>
+          <w:rFonts w:ascii="Times New Roman" w:eastAsia="Times New Roman" w:hAnsi="Times New Roman" w:cs="Times New Roman"/>
           <w:b/>
           <w:bCs/>
-        </w:rPr>
-        <w:t>1. Flash the Final Firmware:</w:t>
-      </w:r>
-      <w:r>
-        <w:t xml:space="preserve"> Ensure your ESP32-S3 is flashed with the latest code we wrote (where TELEMETRY_PING_DELAY_MS = 10 and </w:t>
-      </w:r>
-      <w:proofErr w:type="spellStart"/>
-      <w:r>
-        <w:t>Mode_BrainDead</w:t>
-      </w:r>
-      <w:proofErr w:type="spellEnd"/>
-      <w:r>
-        <w:t xml:space="preserve"> is fully wired into the </w:t>
-      </w:r>
-      <w:proofErr w:type="spellStart"/>
-      <w:r>
-        <w:t>BehaviourEngine</w:t>
-      </w:r>
-      <w:proofErr w:type="spellEnd"/>
-      <w:r>
-        <w:t>).</w:t>
+          <w:kern w:val="0"/>
+          <w14:ligatures w14:val="none"/>
+        </w:rPr>
+        <w:t>Flash the Final Firmware:</w:t>
+      </w:r>
+      <w:r>
+        <w:rPr>
+          <w:rFonts w:ascii="Times New Roman" w:eastAsia="Times New Roman" w:hAnsi="Times New Roman" w:cs="Times New Roman"/>
+          <w:kern w:val="0"/>
+          <w14:ligatures w14:val="none"/>
+        </w:rPr>
+        <w:t xml:space="preserve"> Ensure your ESP32-S3 is flashed with the latest code, actively broadcasting its BLE services and parsing the 21-byte physics payloads.</w:t>
       </w:r>
     </w:p>
     <w:p>
-      <w:r>
-        <w:rPr>
+      <w:pPr>
+        <w:numPr>
+          <w:ilvl w:val="0"/>
+          <w:numId w:val="5"/>
+        </w:numPr>
+        <w:spacing w:before="100" w:beforeAutospacing="1" w:after="100" w:afterAutospacing="1" w:line="240" w:lineRule="auto"/>
+        <w:jc w:val="both"/>
+        <w:rPr>
+          <w:rFonts w:ascii="Times New Roman" w:eastAsia="Times New Roman" w:hAnsi="Times New Roman" w:cs="Times New Roman"/>
+          <w:kern w:val="0"/>
+          <w14:ligatures w14:val="none"/>
+        </w:rPr>
+      </w:pPr>
+      <w:r>
+        <w:rPr>
+          <w:rFonts w:ascii="Times New Roman" w:eastAsia="Times New Roman" w:hAnsi="Times New Roman" w:cs="Times New Roman"/>
           <w:b/>
           <w:bCs/>
-        </w:rPr>
-        <w:t>2. Isolate the Robot:</w:t>
-      </w:r>
-      <w:r>
-        <w:t xml:space="preserve"> Turn Mister Mischief ON. </w:t>
-      </w:r>
-      <w:r>
-        <w:rPr>
+          <w:kern w:val="0"/>
+          <w14:ligatures w14:val="none"/>
+        </w:rPr>
+        <w:t>Connect the App:</w:t>
+      </w:r>
+      <w:r>
+        <w:rPr>
+          <w:rFonts w:ascii="Times New Roman" w:eastAsia="Times New Roman" w:hAnsi="Times New Roman" w:cs="Times New Roman"/>
+          <w:kern w:val="0"/>
+          <w14:ligatures w14:val="none"/>
+        </w:rPr>
+        <w:t xml:space="preserve"> </w:t>
+      </w:r>
+      <w:r>
+        <w:rPr>
+          <w:rFonts w:ascii="Times New Roman" w:eastAsia="Times New Roman" w:hAnsi="Times New Roman" w:cs="Times New Roman"/>
+          <w:kern w:val="0"/>
+          <w14:ligatures w14:val="none"/>
+        </w:rPr>
+        <w:t>C</w:t>
+      </w:r>
+      <w:r>
+        <w:rPr>
+          <w:rFonts w:ascii="Times New Roman" w:eastAsia="Times New Roman" w:hAnsi="Times New Roman" w:cs="Times New Roman"/>
           <w:b/>
           <w:bCs/>
-        </w:rPr>
-        <w:t>Do NOT connect your Android phone app.</w:t>
-      </w:r>
-      <w:r>
-        <w:t xml:space="preserve"> If you connect the app, the </w:t>
+          <w:kern w:val="0"/>
+          <w14:ligatures w14:val="none"/>
+        </w:rPr>
+        <w:t>onnect your Android phone app</w:t>
+      </w:r>
+      <w:r>
+        <w:rPr>
+          <w:rFonts w:ascii="Times New Roman" w:eastAsia="Times New Roman" w:hAnsi="Times New Roman" w:cs="Times New Roman"/>
+          <w:kern w:val="0"/>
+          <w14:ligatures w14:val="none"/>
+        </w:rPr>
+        <w:t xml:space="preserve">. You must be in </w:t>
       </w:r>
       <w:proofErr w:type="spellStart"/>
       <w:r>
-        <w:t>TeleopCommandBus</w:t>
+        <w:rPr>
+          <w:rFonts w:ascii="Courier New" w:eastAsia="Times New Roman" w:hAnsi="Courier New" w:cs="Courier New"/>
+          <w:kern w:val="0"/>
+          <w:sz w:val="20"/>
+          <w:szCs w:val="20"/>
+          <w14:ligatures w14:val="none"/>
+        </w:rPr>
+        <w:t>Mode_Teleop</w:t>
       </w:r>
       <w:proofErr w:type="spellEnd"/>
       <w:r>
-        <w:t xml:space="preserve"> watchdog might trigger MANUAL_OVERRIDE and bypass the data collection logic entirely.</w:t>
+        <w:rPr>
+          <w:rFonts w:ascii="Times New Roman" w:eastAsia="Times New Roman" w:hAnsi="Times New Roman" w:cs="Times New Roman"/>
+          <w:kern w:val="0"/>
+          <w14:ligatures w14:val="none"/>
+        </w:rPr>
+        <w:t xml:space="preserve">. The robot needs to be actively responding to your throttle commands so the AI can see the </w:t>
+      </w:r>
+      <w:proofErr w:type="spellStart"/>
+      <w:r>
+        <w:rPr>
+          <w:rFonts w:ascii="Courier New" w:eastAsia="Times New Roman" w:hAnsi="Courier New" w:cs="Courier New"/>
+          <w:kern w:val="0"/>
+          <w:sz w:val="20"/>
+          <w:szCs w:val="20"/>
+          <w14:ligatures w14:val="none"/>
+        </w:rPr>
+        <w:t>leftMotorPWM</w:t>
+      </w:r>
+      <w:proofErr w:type="spellEnd"/>
+      <w:r>
+        <w:rPr>
+          <w:rFonts w:ascii="Times New Roman" w:eastAsia="Times New Roman" w:hAnsi="Times New Roman" w:cs="Times New Roman"/>
+          <w:kern w:val="0"/>
+          <w14:ligatures w14:val="none"/>
+        </w:rPr>
+        <w:t xml:space="preserve"> and </w:t>
+      </w:r>
+      <w:proofErr w:type="spellStart"/>
+      <w:r>
+        <w:rPr>
+          <w:rFonts w:ascii="Courier New" w:eastAsia="Times New Roman" w:hAnsi="Courier New" w:cs="Courier New"/>
+          <w:kern w:val="0"/>
+          <w:sz w:val="20"/>
+          <w:szCs w:val="20"/>
+          <w14:ligatures w14:val="none"/>
+        </w:rPr>
+        <w:t>rightMotorPWM</w:t>
+      </w:r>
+      <w:proofErr w:type="spellEnd"/>
+      <w:r>
+        <w:rPr>
+          <w:rFonts w:ascii="Times New Roman" w:eastAsia="Times New Roman" w:hAnsi="Times New Roman" w:cs="Times New Roman"/>
+          <w:kern w:val="0"/>
+          <w14:ligatures w14:val="none"/>
+        </w:rPr>
+        <w:t xml:space="preserve"> values spike while the IMU registers zero movement during a crash.</w:t>
       </w:r>
     </w:p>
     <w:p>
-      <w:r>
-        <w:rPr>
+      <w:pPr>
+        <w:spacing w:before="100" w:beforeAutospacing="1" w:after="100" w:afterAutospacing="1" w:line="240" w:lineRule="auto"/>
+        <w:jc w:val="both"/>
+        <w:outlineLvl w:val="3"/>
+        <w:rPr>
+          <w:rFonts w:ascii="Times New Roman" w:eastAsia="Times New Roman" w:hAnsi="Times New Roman" w:cs="Times New Roman"/>
           <w:b/>
           <w:bCs/>
-        </w:rPr>
-        <w:t>3. Lobotomize the Brain:</w:t>
-      </w:r>
-      <w:r>
-        <w:t xml:space="preserve"> Open your Serial Terminal via USB and send your CLI command:</w:t>
+          <w:kern w:val="0"/>
+          <w14:ligatures w14:val="none"/>
+        </w:rPr>
+      </w:pPr>
+      <w:r>
+        <w:rPr>
+          <w:rFonts w:ascii="Times New Roman" w:eastAsia="Times New Roman" w:hAnsi="Times New Roman" w:cs="Times New Roman"/>
+          <w:b/>
+          <w:bCs/>
+          <w:kern w:val="0"/>
+          <w14:ligatures w14:val="none"/>
+        </w:rPr>
+        <w:t>Phase 2: The Connection &amp; Master Gate</w:t>
       </w:r>
     </w:p>
     <w:p>
-      <w:r>
-        <w:t>set BRAIN_ACTIVE off</w:t>
+      <w:pPr>
+        <w:numPr>
+          <w:ilvl w:val="0"/>
+          <w:numId w:val="6"/>
+        </w:numPr>
+        <w:spacing w:before="100" w:beforeAutospacing="1" w:after="100" w:afterAutospacing="1" w:line="240" w:lineRule="auto"/>
+        <w:jc w:val="both"/>
+        <w:rPr>
+          <w:rFonts w:ascii="Times New Roman" w:eastAsia="Times New Roman" w:hAnsi="Times New Roman" w:cs="Times New Roman"/>
+          <w:kern w:val="0"/>
+          <w14:ligatures w14:val="none"/>
+        </w:rPr>
+      </w:pPr>
+      <w:r>
+        <w:rPr>
+          <w:rFonts w:ascii="Times New Roman" w:eastAsia="Times New Roman" w:hAnsi="Times New Roman" w:cs="Times New Roman"/>
+          <w:b/>
+          <w:bCs/>
+          <w:kern w:val="0"/>
+          <w14:ligatures w14:val="none"/>
+        </w:rPr>
+        <w:t>Launch the Collector:</w:t>
+      </w:r>
+      <w:r>
+        <w:rPr>
+          <w:rFonts w:ascii="Times New Roman" w:eastAsia="Times New Roman" w:hAnsi="Times New Roman" w:cs="Times New Roman"/>
+          <w:kern w:val="0"/>
+          <w14:ligatures w14:val="none"/>
+        </w:rPr>
+        <w:t xml:space="preserve"> Open your PC terminal and run: </w:t>
+      </w:r>
+      <w:r>
+        <w:rPr>
+          <w:rFonts w:ascii="Courier New" w:eastAsia="Times New Roman" w:hAnsi="Courier New" w:cs="Courier New"/>
+          <w:kern w:val="0"/>
+          <w:sz w:val="20"/>
+          <w:szCs w:val="20"/>
+          <w14:ligatures w14:val="none"/>
+        </w:rPr>
+        <w:t>python SupervisedDataCollector.py</w:t>
       </w:r>
     </w:p>
     <w:p>
-      <w:r>
-        <w:t xml:space="preserve">Watch the terminal to confirm the </w:t>
-      </w:r>
-      <w:proofErr w:type="spellStart"/>
-      <w:r>
-        <w:t>BehaviourEngine</w:t>
-      </w:r>
-      <w:proofErr w:type="spellEnd"/>
-      <w:r>
-        <w:t xml:space="preserve"> logs: [MODE] Entered BRAIN_DEAD. Actuators neutralized for data collection. The robot should go completely limp, but the sensor LEDs (like the sonar) should still be pulsing.</w:t>
+      <w:pPr>
+        <w:numPr>
+          <w:ilvl w:val="0"/>
+          <w:numId w:val="6"/>
+        </w:numPr>
+        <w:spacing w:before="100" w:beforeAutospacing="1" w:after="100" w:afterAutospacing="1" w:line="240" w:lineRule="auto"/>
+        <w:jc w:val="both"/>
+        <w:rPr>
+          <w:rFonts w:ascii="Times New Roman" w:eastAsia="Times New Roman" w:hAnsi="Times New Roman" w:cs="Times New Roman"/>
+          <w:kern w:val="0"/>
+          <w14:ligatures w14:val="none"/>
+        </w:rPr>
+      </w:pPr>
+      <w:r>
+        <w:rPr>
+          <w:rFonts w:ascii="Times New Roman" w:eastAsia="Times New Roman" w:hAnsi="Times New Roman" w:cs="Times New Roman"/>
+          <w:b/>
+          <w:bCs/>
+          <w:kern w:val="0"/>
+          <w14:ligatures w14:val="none"/>
+        </w:rPr>
+        <w:t>Verify the Baseline:</w:t>
+      </w:r>
+      <w:r>
+        <w:rPr>
+          <w:rFonts w:ascii="Times New Roman" w:eastAsia="Times New Roman" w:hAnsi="Times New Roman" w:cs="Times New Roman"/>
+          <w:kern w:val="0"/>
+          <w14:ligatures w14:val="none"/>
+        </w:rPr>
+        <w:t xml:space="preserve"> Wait for the BLE to connect. Once the UI renders, move the joystick on your Android app slightly. Look at the </w:t>
+      </w:r>
+      <w:r>
+        <w:rPr>
+          <w:rFonts w:ascii="Courier New" w:eastAsia="Times New Roman" w:hAnsi="Courier New" w:cs="Courier New"/>
+          <w:kern w:val="0"/>
+          <w:sz w:val="20"/>
+          <w:szCs w:val="20"/>
+          <w14:ligatures w14:val="none"/>
+        </w:rPr>
+        <w:t>RAW HARDWARE</w:t>
+      </w:r>
+      <w:r>
+        <w:rPr>
+          <w:rFonts w:ascii="Times New Roman" w:eastAsia="Times New Roman" w:hAnsi="Times New Roman" w:cs="Times New Roman"/>
+          <w:kern w:val="0"/>
+          <w14:ligatures w14:val="none"/>
+        </w:rPr>
+        <w:t xml:space="preserve"> section to confirm the PWM and Sonar values are updating live.</w:t>
       </w:r>
     </w:p>
     <w:p>
       <w:pPr>
-        <w:rPr>
+        <w:numPr>
+          <w:ilvl w:val="0"/>
+          <w:numId w:val="6"/>
+        </w:numPr>
+        <w:spacing w:before="100" w:beforeAutospacing="1" w:after="100" w:afterAutospacing="1" w:line="240" w:lineRule="auto"/>
+        <w:jc w:val="both"/>
+        <w:rPr>
+          <w:rFonts w:ascii="Times New Roman" w:eastAsia="Times New Roman" w:hAnsi="Times New Roman" w:cs="Times New Roman"/>
+          <w:kern w:val="0"/>
+          <w14:ligatures w14:val="none"/>
+        </w:rPr>
+      </w:pPr>
+      <w:r>
+        <w:rPr>
+          <w:rFonts w:ascii="Times New Roman" w:eastAsia="Times New Roman" w:hAnsi="Times New Roman" w:cs="Times New Roman"/>
           <w:b/>
           <w:bCs/>
-          <w:sz w:val="28"/>
-          <w:szCs w:val="28"/>
-        </w:rPr>
-      </w:pPr>
-      <w:r>
-        <w:rPr>
+          <w:kern w:val="0"/>
+          <w14:ligatures w14:val="none"/>
+        </w:rPr>
+        <w:t>Understand the Gate:</w:t>
+      </w:r>
+      <w:r>
+        <w:rPr>
+          <w:rFonts w:ascii="Times New Roman" w:eastAsia="Times New Roman" w:hAnsi="Times New Roman" w:cs="Times New Roman"/>
+          <w:kern w:val="0"/>
+          <w14:ligatures w14:val="none"/>
+        </w:rPr>
+        <w:t xml:space="preserve"> Your script starts </w:t>
+      </w:r>
+      <w:r>
+        <w:rPr>
+          <w:rFonts w:ascii="Times New Roman" w:eastAsia="Times New Roman" w:hAnsi="Times New Roman" w:cs="Times New Roman"/>
           <w:b/>
           <w:bCs/>
-          <w:sz w:val="28"/>
-          <w:szCs w:val="28"/>
-        </w:rPr>
-        <w:t>Phase 2: The Connection</w:t>
+          <w:kern w:val="0"/>
+          <w14:ligatures w14:val="none"/>
+        </w:rPr>
+        <w:t>PAUSED</w:t>
+      </w:r>
+      <w:r>
+        <w:rPr>
+          <w:rFonts w:ascii="Times New Roman" w:eastAsia="Times New Roman" w:hAnsi="Times New Roman" w:cs="Times New Roman"/>
+          <w:kern w:val="0"/>
+          <w14:ligatures w14:val="none"/>
+        </w:rPr>
+        <w:t xml:space="preserve"> (red banner). No data is being written. You must press </w:t>
+      </w:r>
+      <w:r>
+        <w:rPr>
+          <w:rFonts w:ascii="Courier New" w:eastAsia="Times New Roman" w:hAnsi="Courier New" w:cs="Courier New"/>
+          <w:kern w:val="0"/>
+          <w:sz w:val="20"/>
+          <w:szCs w:val="20"/>
+          <w14:ligatures w14:val="none"/>
+        </w:rPr>
+        <w:t>ENTER</w:t>
+      </w:r>
+      <w:r>
+        <w:rPr>
+          <w:rFonts w:ascii="Times New Roman" w:eastAsia="Times New Roman" w:hAnsi="Times New Roman" w:cs="Times New Roman"/>
+          <w:kern w:val="0"/>
+          <w14:ligatures w14:val="none"/>
+        </w:rPr>
+        <w:t xml:space="preserve"> to turn the banner green and start logging. If you make a mistake during a drill, immediately press </w:t>
+      </w:r>
+      <w:r>
+        <w:rPr>
+          <w:rFonts w:ascii="Courier New" w:eastAsia="Times New Roman" w:hAnsi="Courier New" w:cs="Courier New"/>
+          <w:kern w:val="0"/>
+          <w:sz w:val="20"/>
+          <w:szCs w:val="20"/>
+          <w14:ligatures w14:val="none"/>
+        </w:rPr>
+        <w:t>BACKSPACE</w:t>
+      </w:r>
+      <w:r>
+        <w:rPr>
+          <w:rFonts w:ascii="Times New Roman" w:eastAsia="Times New Roman" w:hAnsi="Times New Roman" w:cs="Times New Roman"/>
+          <w:kern w:val="0"/>
+          <w14:ligatures w14:val="none"/>
+        </w:rPr>
+        <w:t xml:space="preserve"> to wipe the CSV and restart.</w:t>
       </w:r>
     </w:p>
     <w:p>
-      <w:r>
-        <w:rPr>
+      <w:pPr>
+        <w:spacing w:before="100" w:beforeAutospacing="1" w:after="100" w:afterAutospacing="1" w:line="240" w:lineRule="auto"/>
+        <w:jc w:val="both"/>
+        <w:outlineLvl w:val="3"/>
+        <w:rPr>
+          <w:rFonts w:ascii="Times New Roman" w:eastAsia="Times New Roman" w:hAnsi="Times New Roman" w:cs="Times New Roman"/>
           <w:b/>
           <w:bCs/>
-        </w:rPr>
-        <w:t>4. Launch the Collector:</w:t>
-      </w:r>
-      <w:r>
-        <w:t xml:space="preserve"> Open your PC terminal and run:</w:t>
+          <w:kern w:val="0"/>
+          <w14:ligatures w14:val="none"/>
+        </w:rPr>
+      </w:pPr>
+      <w:r>
+        <w:rPr>
+          <w:rFonts w:ascii="Times New Roman" w:eastAsia="Times New Roman" w:hAnsi="Times New Roman" w:cs="Times New Roman"/>
+          <w:b/>
+          <w:bCs/>
+          <w:kern w:val="0"/>
+          <w14:ligatures w14:val="none"/>
+        </w:rPr>
+        <w:t>Phase 3: The "Live Action" Data Collection</w:t>
       </w:r>
     </w:p>
     <w:p>
-      <w:r>
-        <w:t>python SupervisedDataCollector.py</w:t>
+      <w:pPr>
+        <w:spacing w:before="100" w:beforeAutospacing="1" w:after="100" w:afterAutospacing="1" w:line="240" w:lineRule="auto"/>
+        <w:jc w:val="both"/>
+        <w:rPr>
+          <w:rFonts w:ascii="Times New Roman" w:eastAsia="Times New Roman" w:hAnsi="Times New Roman" w:cs="Times New Roman"/>
+          <w:kern w:val="0"/>
+          <w14:ligatures w14:val="none"/>
+        </w:rPr>
+      </w:pPr>
+      <w:r>
+        <w:rPr>
+          <w:rFonts w:ascii="Times New Roman" w:eastAsia="Times New Roman" w:hAnsi="Times New Roman" w:cs="Times New Roman"/>
+          <w:kern w:val="0"/>
+          <w14:ligatures w14:val="none"/>
+        </w:rPr>
+        <w:t>You are now driving with one hand on the Android app and labeling with the other hand on your keyboard.</w:t>
       </w:r>
     </w:p>
     <w:p>
-      <w:r>
-        <w:rPr>
+      <w:pPr>
+        <w:spacing w:before="100" w:beforeAutospacing="1" w:after="100" w:afterAutospacing="1" w:line="240" w:lineRule="auto"/>
+        <w:jc w:val="both"/>
+        <w:rPr>
+          <w:rFonts w:ascii="Times New Roman" w:eastAsia="Times New Roman" w:hAnsi="Times New Roman" w:cs="Times New Roman"/>
+          <w:kern w:val="0"/>
+          <w14:ligatures w14:val="none"/>
+        </w:rPr>
+      </w:pPr>
+      <w:r>
+        <w:rPr>
+          <w:rFonts w:ascii="Times New Roman" w:eastAsia="Times New Roman" w:hAnsi="Times New Roman" w:cs="Times New Roman"/>
           <w:b/>
           <w:bCs/>
-        </w:rPr>
-        <w:t>5. Verify the Baseline:</w:t>
-      </w:r>
-      <w:r>
-        <w:t xml:space="preserve"> Wait for the BLE to connect. Once the UI renders on your screen, don't touch the robot for 5 seconds. Look at the terminal:</w:t>
+          <w:kern w:val="0"/>
+          <w14:ligatures w14:val="none"/>
+        </w:rPr>
+        <w:t>6. The "Stillness" Baseline (10 seconds):</w:t>
       </w:r>
     </w:p>
     <w:p>
       <w:pPr>
         <w:numPr>
           <w:ilvl w:val="0"/>
-          <w:numId w:val="1"/>
+          <w:numId w:val="7"/>
         </w:numPr>
-      </w:pPr>
-      <w:r>
-        <w:t>MODE should say [BRAIN_DEAD] (Target Mode 10).</w:t>
+        <w:spacing w:before="100" w:beforeAutospacing="1" w:after="100" w:afterAutospacing="1" w:line="240" w:lineRule="auto"/>
+        <w:jc w:val="both"/>
+        <w:rPr>
+          <w:rFonts w:ascii="Times New Roman" w:eastAsia="Times New Roman" w:hAnsi="Times New Roman" w:cs="Times New Roman"/>
+          <w:kern w:val="0"/>
+          <w14:ligatures w14:val="none"/>
+        </w:rPr>
+      </w:pPr>
+      <w:r>
+        <w:rPr>
+          <w:rFonts w:ascii="Times New Roman" w:eastAsia="Times New Roman" w:hAnsi="Times New Roman" w:cs="Times New Roman"/>
+          <w:kern w:val="0"/>
+          <w14:ligatures w14:val="none"/>
+        </w:rPr>
+        <w:t>Leave Mister Mischief on the floor. Do not touch the app.</w:t>
       </w:r>
     </w:p>
     <w:p>
       <w:pPr>
         <w:numPr>
           <w:ilvl w:val="0"/>
-          <w:numId w:val="1"/>
+          <w:numId w:val="7"/>
         </w:numPr>
-      </w:pPr>
+        <w:spacing w:before="100" w:beforeAutospacing="1" w:after="100" w:afterAutospacing="1" w:line="240" w:lineRule="auto"/>
+        <w:jc w:val="both"/>
+        <w:rPr>
+          <w:rFonts w:ascii="Times New Roman" w:eastAsia="Times New Roman" w:hAnsi="Times New Roman" w:cs="Times New Roman"/>
+          <w:kern w:val="0"/>
+          <w14:ligatures w14:val="none"/>
+        </w:rPr>
+      </w:pPr>
+      <w:r>
+        <w:rPr>
+          <w:rFonts w:ascii="Times New Roman" w:eastAsia="Times New Roman" w:hAnsi="Times New Roman" w:cs="Times New Roman"/>
+          <w:kern w:val="0"/>
+          <w14:ligatures w14:val="none"/>
+        </w:rPr>
+        <w:t xml:space="preserve">Confirm </w:t>
+      </w:r>
       <w:proofErr w:type="spellStart"/>
       <w:r>
+        <w:rPr>
+          <w:rFonts w:ascii="Courier New" w:eastAsia="Times New Roman" w:hAnsi="Courier New" w:cs="Courier New"/>
+          <w:kern w:val="0"/>
+          <w:sz w:val="20"/>
+          <w:szCs w:val="20"/>
+          <w14:ligatures w14:val="none"/>
+        </w:rPr>
         <w:t>isAbsolutelyStill</w:t>
       </w:r>
       <w:proofErr w:type="spellEnd"/>
       <w:r>
-        <w:t xml:space="preserve"> should say [ON].</w:t>
+        <w:rPr>
+          <w:rFonts w:ascii="Times New Roman" w:eastAsia="Times New Roman" w:hAnsi="Times New Roman" w:cs="Times New Roman"/>
+          <w:kern w:val="0"/>
+          <w14:ligatures w14:val="none"/>
+        </w:rPr>
+        <w:t xml:space="preserve"> says [ON].</w:t>
       </w:r>
     </w:p>
     <w:p>
       <w:pPr>
         <w:numPr>
           <w:ilvl w:val="0"/>
-          <w:numId w:val="1"/>
+          <w:numId w:val="7"/>
         </w:numPr>
-      </w:pPr>
-      <w:r>
+        <w:spacing w:before="100" w:beforeAutospacing="1" w:after="100" w:afterAutospacing="1" w:line="240" w:lineRule="auto"/>
+        <w:jc w:val="both"/>
+        <w:rPr>
+          <w:rFonts w:ascii="Times New Roman" w:eastAsia="Times New Roman" w:hAnsi="Times New Roman" w:cs="Times New Roman"/>
+          <w:kern w:val="0"/>
+          <w14:ligatures w14:val="none"/>
+        </w:rPr>
+      </w:pPr>
+      <w:r>
+        <w:rPr>
+          <w:rFonts w:ascii="Times New Roman" w:eastAsia="Times New Roman" w:hAnsi="Times New Roman" w:cs="Times New Roman"/>
+          <w:kern w:val="0"/>
+          <w14:ligatures w14:val="none"/>
+        </w:rPr>
+        <w:t xml:space="preserve">Press </w:t>
+      </w:r>
+      <w:r>
+        <w:rPr>
+          <w:rFonts w:ascii="Courier New" w:eastAsia="Times New Roman" w:hAnsi="Courier New" w:cs="Courier New"/>
+          <w:kern w:val="0"/>
+          <w:sz w:val="20"/>
+          <w:szCs w:val="20"/>
+          <w14:ligatures w14:val="none"/>
+        </w:rPr>
+        <w:t>ENTER</w:t>
+      </w:r>
+      <w:r>
+        <w:rPr>
+          <w:rFonts w:ascii="Times New Roman" w:eastAsia="Times New Roman" w:hAnsi="Times New Roman" w:cs="Times New Roman"/>
+          <w:kern w:val="0"/>
+          <w14:ligatures w14:val="none"/>
+        </w:rPr>
+        <w:t xml:space="preserve"> to start recording. Wait 10 seconds. This teaches the AI the baseline noise floor of the IMU.</w:t>
+      </w:r>
+    </w:p>
+    <w:p>
+      <w:pPr>
+        <w:numPr>
+          <w:ilvl w:val="0"/>
+          <w:numId w:val="7"/>
+        </w:numPr>
+        <w:spacing w:before="100" w:beforeAutospacing="1" w:after="100" w:afterAutospacing="1" w:line="240" w:lineRule="auto"/>
+        <w:jc w:val="both"/>
+        <w:rPr>
+          <w:rFonts w:ascii="Times New Roman" w:eastAsia="Times New Roman" w:hAnsi="Times New Roman" w:cs="Times New Roman"/>
+          <w:kern w:val="0"/>
+          <w14:ligatures w14:val="none"/>
+        </w:rPr>
+      </w:pPr>
+      <w:r>
+        <w:rPr>
+          <w:rFonts w:ascii="Times New Roman" w:eastAsia="Times New Roman" w:hAnsi="Times New Roman" w:cs="Times New Roman"/>
+          <w:kern w:val="0"/>
+          <w14:ligatures w14:val="none"/>
+        </w:rPr>
+        <w:t xml:space="preserve">Press </w:t>
+      </w:r>
+      <w:r>
+        <w:rPr>
+          <w:rFonts w:ascii="Courier New" w:eastAsia="Times New Roman" w:hAnsi="Courier New" w:cs="Courier New"/>
+          <w:kern w:val="0"/>
+          <w:sz w:val="20"/>
+          <w:szCs w:val="20"/>
+          <w14:ligatures w14:val="none"/>
+        </w:rPr>
+        <w:t>ENTER</w:t>
+      </w:r>
+      <w:r>
+        <w:rPr>
+          <w:rFonts w:ascii="Times New Roman" w:eastAsia="Times New Roman" w:hAnsi="Times New Roman" w:cs="Times New Roman"/>
+          <w:kern w:val="0"/>
+          <w14:ligatures w14:val="none"/>
+        </w:rPr>
+        <w:t xml:space="preserve"> to pause.</w:t>
+      </w:r>
+    </w:p>
+    <w:p>
+      <w:pPr>
+        <w:spacing w:before="100" w:beforeAutospacing="1" w:after="100" w:afterAutospacing="1" w:line="240" w:lineRule="auto"/>
+        <w:jc w:val="both"/>
+        <w:rPr>
+          <w:rFonts w:ascii="Times New Roman" w:eastAsia="Times New Roman" w:hAnsi="Times New Roman" w:cs="Times New Roman"/>
+          <w:kern w:val="0"/>
+          <w14:ligatures w14:val="none"/>
+        </w:rPr>
+      </w:pPr>
+      <w:r>
+        <w:rPr>
+          <w:rFonts w:ascii="Times New Roman" w:eastAsia="Times New Roman" w:hAnsi="Times New Roman" w:cs="Times New Roman"/>
+          <w:b/>
+          <w:bCs/>
+          <w:kern w:val="0"/>
+          <w14:ligatures w14:val="none"/>
+        </w:rPr>
+        <w:t>7. The "Live Driving &amp; Hazards" Drill (3 minutes):</w:t>
+      </w:r>
+    </w:p>
+    <w:p>
+      <w:pPr>
+        <w:numPr>
+          <w:ilvl w:val="0"/>
+          <w:numId w:val="8"/>
+        </w:numPr>
+        <w:spacing w:before="100" w:beforeAutospacing="1" w:after="100" w:afterAutospacing="1" w:line="240" w:lineRule="auto"/>
+        <w:jc w:val="both"/>
+        <w:rPr>
+          <w:rFonts w:ascii="Times New Roman" w:eastAsia="Times New Roman" w:hAnsi="Times New Roman" w:cs="Times New Roman"/>
+          <w:kern w:val="0"/>
+          <w14:ligatures w14:val="none"/>
+        </w:rPr>
+      </w:pPr>
+      <w:r>
+        <w:rPr>
+          <w:rFonts w:ascii="Times New Roman" w:eastAsia="Times New Roman" w:hAnsi="Times New Roman" w:cs="Times New Roman"/>
+          <w:kern w:val="0"/>
+          <w14:ligatures w14:val="none"/>
+        </w:rPr>
+        <w:t xml:space="preserve">Press </w:t>
+      </w:r>
+      <w:r>
+        <w:rPr>
+          <w:rFonts w:ascii="Courier New" w:eastAsia="Times New Roman" w:hAnsi="Courier New" w:cs="Courier New"/>
+          <w:kern w:val="0"/>
+          <w:sz w:val="20"/>
+          <w:szCs w:val="20"/>
+          <w14:ligatures w14:val="none"/>
+        </w:rPr>
+        <w:t>ENTER</w:t>
+      </w:r>
+      <w:r>
+        <w:rPr>
+          <w:rFonts w:ascii="Times New Roman" w:eastAsia="Times New Roman" w:hAnsi="Times New Roman" w:cs="Times New Roman"/>
+          <w:kern w:val="0"/>
+          <w14:ligatures w14:val="none"/>
+        </w:rPr>
+        <w:t xml:space="preserve"> to start recording.</w:t>
+      </w:r>
+    </w:p>
+    <w:p>
+      <w:pPr>
+        <w:numPr>
+          <w:ilvl w:val="0"/>
+          <w:numId w:val="8"/>
+        </w:numPr>
+        <w:spacing w:before="100" w:beforeAutospacing="1" w:after="100" w:afterAutospacing="1" w:line="240" w:lineRule="auto"/>
+        <w:jc w:val="both"/>
+        <w:rPr>
+          <w:rFonts w:ascii="Times New Roman" w:eastAsia="Times New Roman" w:hAnsi="Times New Roman" w:cs="Times New Roman"/>
+          <w:kern w:val="0"/>
+          <w14:ligatures w14:val="none"/>
+        </w:rPr>
+      </w:pPr>
+      <w:r>
+        <w:rPr>
+          <w:rFonts w:ascii="Times New Roman" w:eastAsia="Times New Roman" w:hAnsi="Times New Roman" w:cs="Times New Roman"/>
+          <w:b/>
+          <w:bCs/>
+          <w:kern w:val="0"/>
+          <w14:ligatures w14:val="none"/>
+        </w:rPr>
         <w:lastRenderedPageBreak/>
-        <w:t xml:space="preserve">Ensure the CSV is populating without crashing. </w:t>
-      </w:r>
-      <w:r>
-        <w:rPr>
+        <w:t>Dynamic Driving:</w:t>
+      </w:r>
+      <w:r>
+        <w:rPr>
+          <w:rFonts w:ascii="Times New Roman" w:eastAsia="Times New Roman" w:hAnsi="Times New Roman" w:cs="Times New Roman"/>
+          <w:kern w:val="0"/>
+          <w14:ligatures w14:val="none"/>
+        </w:rPr>
+        <w:t xml:space="preserve"> Drive normally around the room. Hold </w:t>
+      </w:r>
+      <w:r>
+        <w:rPr>
+          <w:rFonts w:ascii="Courier New" w:eastAsia="Times New Roman" w:hAnsi="Courier New" w:cs="Courier New"/>
+          <w:kern w:val="0"/>
+          <w:sz w:val="20"/>
+          <w:szCs w:val="20"/>
+          <w14:ligatures w14:val="none"/>
+        </w:rPr>
+        <w:t>SHIFT</w:t>
+      </w:r>
+      <w:r>
+        <w:rPr>
+          <w:rFonts w:ascii="Times New Roman" w:eastAsia="Times New Roman" w:hAnsi="Times New Roman" w:cs="Times New Roman"/>
+          <w:kern w:val="0"/>
+          <w14:ligatures w14:val="none"/>
+        </w:rPr>
+        <w:t xml:space="preserve"> while driving to turn </w:t>
+      </w:r>
+      <w:proofErr w:type="spellStart"/>
+      <w:r>
+        <w:rPr>
+          <w:rFonts w:ascii="Courier New" w:eastAsia="Times New Roman" w:hAnsi="Courier New" w:cs="Courier New"/>
+          <w:kern w:val="0"/>
+          <w:sz w:val="20"/>
+          <w:szCs w:val="20"/>
+          <w14:ligatures w14:val="none"/>
+        </w:rPr>
+        <w:t>isAbsolutelyStill</w:t>
+      </w:r>
+      <w:proofErr w:type="spellEnd"/>
+      <w:r>
+        <w:rPr>
+          <w:rFonts w:ascii="Times New Roman" w:eastAsia="Times New Roman" w:hAnsi="Times New Roman" w:cs="Times New Roman"/>
+          <w:kern w:val="0"/>
+          <w14:ligatures w14:val="none"/>
+        </w:rPr>
+        <w:t xml:space="preserve"> OFF.</w:t>
+      </w:r>
+    </w:p>
+    <w:p>
+      <w:pPr>
+        <w:numPr>
+          <w:ilvl w:val="0"/>
+          <w:numId w:val="8"/>
+        </w:numPr>
+        <w:spacing w:before="100" w:beforeAutospacing="1" w:after="100" w:afterAutospacing="1" w:line="240" w:lineRule="auto"/>
+        <w:jc w:val="both"/>
+        <w:rPr>
+          <w:rFonts w:ascii="Times New Roman" w:eastAsia="Times New Roman" w:hAnsi="Times New Roman" w:cs="Times New Roman"/>
+          <w:kern w:val="0"/>
+          <w14:ligatures w14:val="none"/>
+        </w:rPr>
+      </w:pPr>
+      <w:r>
+        <w:rPr>
+          <w:rFonts w:ascii="Times New Roman" w:eastAsia="Times New Roman" w:hAnsi="Times New Roman" w:cs="Times New Roman"/>
+          <w:b/>
+          <w:bCs/>
+          <w:kern w:val="0"/>
+          <w14:ligatures w14:val="none"/>
+        </w:rPr>
+        <w:t>The Wall Crash:</w:t>
+      </w:r>
+      <w:r>
+        <w:rPr>
+          <w:rFonts w:ascii="Times New Roman" w:eastAsia="Times New Roman" w:hAnsi="Times New Roman" w:cs="Times New Roman"/>
+          <w:kern w:val="0"/>
+          <w14:ligatures w14:val="none"/>
+        </w:rPr>
+        <w:t xml:space="preserve"> Drive full speed into a wall or baseboard. The exact millisecond you hit, press and hold </w:t>
+      </w:r>
+      <w:r>
+        <w:rPr>
+          <w:rFonts w:ascii="Courier New" w:eastAsia="Times New Roman" w:hAnsi="Courier New" w:cs="Courier New"/>
+          <w:kern w:val="0"/>
+          <w:sz w:val="20"/>
+          <w:szCs w:val="20"/>
+          <w14:ligatures w14:val="none"/>
+        </w:rPr>
+        <w:t>W</w:t>
+      </w:r>
+      <w:r>
+        <w:rPr>
+          <w:rFonts w:ascii="Times New Roman" w:eastAsia="Times New Roman" w:hAnsi="Times New Roman" w:cs="Times New Roman"/>
+          <w:kern w:val="0"/>
+          <w14:ligatures w14:val="none"/>
+        </w:rPr>
+        <w:t xml:space="preserve"> (</w:t>
+      </w:r>
+      <w:proofErr w:type="spellStart"/>
+      <w:r>
+        <w:rPr>
+          <w:rFonts w:ascii="Courier New" w:eastAsia="Times New Roman" w:hAnsi="Courier New" w:cs="Courier New"/>
+          <w:kern w:val="0"/>
+          <w:sz w:val="20"/>
+          <w:szCs w:val="20"/>
+          <w14:ligatures w14:val="none"/>
+        </w:rPr>
+        <w:t>hazardDetected</w:t>
+      </w:r>
+      <w:proofErr w:type="spellEnd"/>
+      <w:r>
+        <w:rPr>
+          <w:rFonts w:ascii="Times New Roman" w:eastAsia="Times New Roman" w:hAnsi="Times New Roman" w:cs="Times New Roman"/>
+          <w:kern w:val="0"/>
+          <w14:ligatures w14:val="none"/>
+        </w:rPr>
+        <w:t xml:space="preserve">). Release </w:t>
+      </w:r>
+      <w:r>
+        <w:rPr>
+          <w:rFonts w:ascii="Courier New" w:eastAsia="Times New Roman" w:hAnsi="Courier New" w:cs="Courier New"/>
+          <w:kern w:val="0"/>
+          <w:sz w:val="20"/>
+          <w:szCs w:val="20"/>
+          <w14:ligatures w14:val="none"/>
+        </w:rPr>
+        <w:t>W</w:t>
+      </w:r>
+      <w:r>
+        <w:rPr>
+          <w:rFonts w:ascii="Times New Roman" w:eastAsia="Times New Roman" w:hAnsi="Times New Roman" w:cs="Times New Roman"/>
+          <w:kern w:val="0"/>
+          <w14:ligatures w14:val="none"/>
+        </w:rPr>
+        <w:t xml:space="preserve"> and the app throttle when he settles.</w:t>
+      </w:r>
+    </w:p>
+    <w:p>
+      <w:pPr>
+        <w:numPr>
+          <w:ilvl w:val="0"/>
+          <w:numId w:val="8"/>
+        </w:numPr>
+        <w:spacing w:before="100" w:beforeAutospacing="1" w:after="100" w:afterAutospacing="1" w:line="240" w:lineRule="auto"/>
+        <w:jc w:val="both"/>
+        <w:rPr>
+          <w:rFonts w:ascii="Times New Roman" w:eastAsia="Times New Roman" w:hAnsi="Times New Roman" w:cs="Times New Roman"/>
+          <w:kern w:val="0"/>
+          <w14:ligatures w14:val="none"/>
+        </w:rPr>
+      </w:pPr>
+      <w:r>
+        <w:rPr>
+          <w:rFonts w:ascii="Times New Roman" w:eastAsia="Times New Roman" w:hAnsi="Times New Roman" w:cs="Times New Roman"/>
+          <w:b/>
+          <w:bCs/>
+          <w:kern w:val="0"/>
+          <w14:ligatures w14:val="none"/>
+        </w:rPr>
+        <w:t>The Track Bind:</w:t>
+      </w:r>
+      <w:r>
+        <w:rPr>
+          <w:rFonts w:ascii="Times New Roman" w:eastAsia="Times New Roman" w:hAnsi="Times New Roman" w:cs="Times New Roman"/>
+          <w:kern w:val="0"/>
+          <w14:ligatures w14:val="none"/>
+        </w:rPr>
+        <w:t xml:space="preserve"> Drive him directly into an immovable object (like a heavy shoe). Keep the throttle pegged forward on the app so the tracks are slipping or the motors are whining, but the robot isn't moving. Hold </w:t>
+      </w:r>
+      <w:r>
+        <w:rPr>
+          <w:rFonts w:ascii="Courier New" w:eastAsia="Times New Roman" w:hAnsi="Courier New" w:cs="Courier New"/>
+          <w:kern w:val="0"/>
+          <w:sz w:val="20"/>
+          <w:szCs w:val="20"/>
+          <w14:ligatures w14:val="none"/>
+        </w:rPr>
+        <w:t>R</w:t>
+      </w:r>
+      <w:r>
+        <w:rPr>
+          <w:rFonts w:ascii="Times New Roman" w:eastAsia="Times New Roman" w:hAnsi="Times New Roman" w:cs="Times New Roman"/>
+          <w:kern w:val="0"/>
+          <w14:ligatures w14:val="none"/>
+        </w:rPr>
+        <w:t xml:space="preserve"> (</w:t>
+      </w:r>
+      <w:proofErr w:type="spellStart"/>
+      <w:r>
+        <w:rPr>
+          <w:rFonts w:ascii="Courier New" w:eastAsia="Times New Roman" w:hAnsi="Courier New" w:cs="Courier New"/>
+          <w:kern w:val="0"/>
+          <w:sz w:val="20"/>
+          <w:szCs w:val="20"/>
+          <w14:ligatures w14:val="none"/>
+        </w:rPr>
+        <w:t>isStuck</w:t>
+      </w:r>
+      <w:proofErr w:type="spellEnd"/>
+      <w:r>
+        <w:rPr>
+          <w:rFonts w:ascii="Times New Roman" w:eastAsia="Times New Roman" w:hAnsi="Times New Roman" w:cs="Times New Roman"/>
+          <w:kern w:val="0"/>
+          <w14:ligatures w14:val="none"/>
+        </w:rPr>
+        <w:t xml:space="preserve">) the entire time. Release </w:t>
+      </w:r>
+      <w:r>
+        <w:rPr>
+          <w:rFonts w:ascii="Courier New" w:eastAsia="Times New Roman" w:hAnsi="Courier New" w:cs="Courier New"/>
+          <w:kern w:val="0"/>
+          <w:sz w:val="20"/>
+          <w:szCs w:val="20"/>
+          <w14:ligatures w14:val="none"/>
+        </w:rPr>
+        <w:t>R</w:t>
+      </w:r>
+      <w:r>
+        <w:rPr>
+          <w:rFonts w:ascii="Times New Roman" w:eastAsia="Times New Roman" w:hAnsi="Times New Roman" w:cs="Times New Roman"/>
+          <w:kern w:val="0"/>
+          <w14:ligatures w14:val="none"/>
+        </w:rPr>
+        <w:t xml:space="preserve"> when you let off the app throttle.</w:t>
+      </w:r>
+    </w:p>
+    <w:p>
+      <w:pPr>
+        <w:numPr>
+          <w:ilvl w:val="0"/>
+          <w:numId w:val="8"/>
+        </w:numPr>
+        <w:spacing w:before="100" w:beforeAutospacing="1" w:after="100" w:afterAutospacing="1" w:line="240" w:lineRule="auto"/>
+        <w:jc w:val="both"/>
+        <w:rPr>
+          <w:rFonts w:ascii="Times New Roman" w:eastAsia="Times New Roman" w:hAnsi="Times New Roman" w:cs="Times New Roman"/>
+          <w:kern w:val="0"/>
+          <w14:ligatures w14:val="none"/>
+        </w:rPr>
+      </w:pPr>
+      <w:r>
+        <w:rPr>
+          <w:rFonts w:ascii="Times New Roman" w:eastAsia="Times New Roman" w:hAnsi="Times New Roman" w:cs="Times New Roman"/>
+          <w:kern w:val="0"/>
+          <w14:ligatures w14:val="none"/>
+        </w:rPr>
+        <w:t xml:space="preserve">Press </w:t>
+      </w:r>
+      <w:r>
+        <w:rPr>
+          <w:rFonts w:ascii="Courier New" w:eastAsia="Times New Roman" w:hAnsi="Courier New" w:cs="Courier New"/>
+          <w:kern w:val="0"/>
+          <w:sz w:val="20"/>
+          <w:szCs w:val="20"/>
+          <w14:ligatures w14:val="none"/>
+        </w:rPr>
+        <w:t>ENTER</w:t>
+      </w:r>
+      <w:r>
+        <w:rPr>
+          <w:rFonts w:ascii="Times New Roman" w:eastAsia="Times New Roman" w:hAnsi="Times New Roman" w:cs="Times New Roman"/>
+          <w:kern w:val="0"/>
+          <w14:ligatures w14:val="none"/>
+        </w:rPr>
+        <w:t xml:space="preserve"> to pause.</w:t>
+      </w:r>
+    </w:p>
+    <w:p>
+      <w:pPr>
+        <w:spacing w:before="100" w:beforeAutospacing="1" w:after="100" w:afterAutospacing="1" w:line="240" w:lineRule="auto"/>
+        <w:jc w:val="both"/>
+        <w:rPr>
+          <w:rFonts w:ascii="Times New Roman" w:eastAsia="Times New Roman" w:hAnsi="Times New Roman" w:cs="Times New Roman"/>
+          <w:kern w:val="0"/>
+          <w14:ligatures w14:val="none"/>
+        </w:rPr>
+      </w:pPr>
+      <w:r>
+        <w:rPr>
+          <w:rFonts w:ascii="Times New Roman" w:eastAsia="Times New Roman" w:hAnsi="Times New Roman" w:cs="Times New Roman"/>
+          <w:b/>
+          <w:bCs/>
+          <w:kern w:val="0"/>
+          <w14:ligatures w14:val="none"/>
+        </w:rPr>
+        <w:t>8. The "Handling &amp; Orientations" Drill (2 minutes):</w:t>
+      </w:r>
+      <w:r>
+        <w:rPr>
+          <w:rFonts w:ascii="Times New Roman" w:eastAsia="Times New Roman" w:hAnsi="Times New Roman" w:cs="Times New Roman"/>
+          <w:kern w:val="0"/>
+          <w14:ligatures w14:val="none"/>
+        </w:rPr>
+        <w:t xml:space="preserve"> Because Orientations are "Sticky" (they stay on until you press another one), always set the physical state </w:t>
+      </w:r>
+      <w:r>
+        <w:rPr>
+          <w:rFonts w:ascii="Times New Roman" w:eastAsia="Times New Roman" w:hAnsi="Times New Roman" w:cs="Times New Roman"/>
           <w:i/>
           <w:iCs/>
-        </w:rPr>
-        <w:t>(If the ESP32 reboots or the UI freezes here, you hit the BLE limit and need to change TELEMETRY_PING_DELAY_MS back to 20 and re-flash).</w:t>
+          <w:kern w:val="0"/>
+          <w14:ligatures w14:val="none"/>
+        </w:rPr>
+        <w:t>before</w:t>
+      </w:r>
+      <w:r>
+        <w:rPr>
+          <w:rFonts w:ascii="Times New Roman" w:eastAsia="Times New Roman" w:hAnsi="Times New Roman" w:cs="Times New Roman"/>
+          <w:kern w:val="0"/>
+          <w14:ligatures w14:val="none"/>
+        </w:rPr>
+        <w:t xml:space="preserve"> you press record.</w:t>
       </w:r>
     </w:p>
     <w:p>
       <w:pPr>
-        <w:rPr>
+        <w:numPr>
+          <w:ilvl w:val="0"/>
+          <w:numId w:val="9"/>
+        </w:numPr>
+        <w:spacing w:before="100" w:beforeAutospacing="1" w:after="100" w:afterAutospacing="1" w:line="240" w:lineRule="auto"/>
+        <w:jc w:val="both"/>
+        <w:rPr>
+          <w:rFonts w:ascii="Times New Roman" w:eastAsia="Times New Roman" w:hAnsi="Times New Roman" w:cs="Times New Roman"/>
+          <w:kern w:val="0"/>
+          <w14:ligatures w14:val="none"/>
+        </w:rPr>
+      </w:pPr>
+      <w:r>
+        <w:rPr>
+          <w:rFonts w:ascii="Times New Roman" w:eastAsia="Times New Roman" w:hAnsi="Times New Roman" w:cs="Times New Roman"/>
+          <w:kern w:val="0"/>
+          <w14:ligatures w14:val="none"/>
+        </w:rPr>
+        <w:t xml:space="preserve">Tap </w:t>
+      </w:r>
+      <w:r>
+        <w:rPr>
+          <w:rFonts w:ascii="Courier New" w:eastAsia="Times New Roman" w:hAnsi="Courier New" w:cs="Courier New"/>
+          <w:kern w:val="0"/>
+          <w:sz w:val="20"/>
+          <w:szCs w:val="20"/>
+          <w14:ligatures w14:val="none"/>
+        </w:rPr>
+        <w:t>SPACE</w:t>
+      </w:r>
+      <w:r>
+        <w:rPr>
+          <w:rFonts w:ascii="Times New Roman" w:eastAsia="Times New Roman" w:hAnsi="Times New Roman" w:cs="Times New Roman"/>
+          <w:kern w:val="0"/>
+          <w14:ligatures w14:val="none"/>
+        </w:rPr>
+        <w:t xml:space="preserve"> to turn </w:t>
+      </w:r>
+      <w:proofErr w:type="spellStart"/>
+      <w:r>
+        <w:rPr>
+          <w:rFonts w:ascii="Courier New" w:eastAsia="Times New Roman" w:hAnsi="Courier New" w:cs="Courier New"/>
+          <w:kern w:val="0"/>
+          <w:sz w:val="20"/>
+          <w:szCs w:val="20"/>
+          <w14:ligatures w14:val="none"/>
+        </w:rPr>
+        <w:t>isHandling</w:t>
+      </w:r>
+      <w:proofErr w:type="spellEnd"/>
+      <w:r>
+        <w:rPr>
+          <w:rFonts w:ascii="Times New Roman" w:eastAsia="Times New Roman" w:hAnsi="Times New Roman" w:cs="Times New Roman"/>
+          <w:kern w:val="0"/>
+          <w14:ligatures w14:val="none"/>
+        </w:rPr>
+        <w:t xml:space="preserve"> [ON]. Pick him up.</w:t>
+      </w:r>
+    </w:p>
+    <w:p>
+      <w:pPr>
+        <w:numPr>
+          <w:ilvl w:val="0"/>
+          <w:numId w:val="9"/>
+        </w:numPr>
+        <w:spacing w:before="100" w:beforeAutospacing="1" w:after="100" w:afterAutospacing="1" w:line="240" w:lineRule="auto"/>
+        <w:jc w:val="both"/>
+        <w:rPr>
+          <w:rFonts w:ascii="Times New Roman" w:eastAsia="Times New Roman" w:hAnsi="Times New Roman" w:cs="Times New Roman"/>
+          <w:kern w:val="0"/>
+          <w14:ligatures w14:val="none"/>
+        </w:rPr>
+      </w:pPr>
+      <w:r>
+        <w:rPr>
+          <w:rFonts w:ascii="Times New Roman" w:eastAsia="Times New Roman" w:hAnsi="Times New Roman" w:cs="Times New Roman"/>
+          <w:kern w:val="0"/>
+          <w14:ligatures w14:val="none"/>
+        </w:rPr>
+        <w:t xml:space="preserve">Tap the </w:t>
+      </w:r>
+      <w:r>
+        <w:rPr>
+          <w:rFonts w:ascii="Times New Roman" w:eastAsia="Times New Roman" w:hAnsi="Times New Roman" w:cs="Times New Roman"/>
           <w:b/>
           <w:bCs/>
-        </w:rPr>
-      </w:pPr>
-      <w:r>
-        <w:rPr>
+          <w:kern w:val="0"/>
+          <w14:ligatures w14:val="none"/>
+        </w:rPr>
+        <w:t>Left Arrow</w:t>
+      </w:r>
+      <w:r>
+        <w:rPr>
+          <w:rFonts w:ascii="Times New Roman" w:eastAsia="Times New Roman" w:hAnsi="Times New Roman" w:cs="Times New Roman"/>
+          <w:kern w:val="0"/>
+          <w14:ligatures w14:val="none"/>
+        </w:rPr>
+        <w:t xml:space="preserve"> (</w:t>
+      </w:r>
+      <w:proofErr w:type="spellStart"/>
+      <w:r>
+        <w:rPr>
+          <w:rFonts w:ascii="Courier New" w:eastAsia="Times New Roman" w:hAnsi="Courier New" w:cs="Courier New"/>
+          <w:kern w:val="0"/>
+          <w:sz w:val="20"/>
+          <w:szCs w:val="20"/>
+          <w14:ligatures w14:val="none"/>
+        </w:rPr>
+        <w:t>TipLeft</w:t>
+      </w:r>
+      <w:proofErr w:type="spellEnd"/>
+      <w:r>
+        <w:rPr>
+          <w:rFonts w:ascii="Times New Roman" w:eastAsia="Times New Roman" w:hAnsi="Times New Roman" w:cs="Times New Roman"/>
+          <w:kern w:val="0"/>
+          <w14:ligatures w14:val="none"/>
+        </w:rPr>
+        <w:t xml:space="preserve">). Hold him tilted on his left track. Press </w:t>
+      </w:r>
+      <w:r>
+        <w:rPr>
+          <w:rFonts w:ascii="Courier New" w:eastAsia="Times New Roman" w:hAnsi="Courier New" w:cs="Courier New"/>
+          <w:kern w:val="0"/>
+          <w:sz w:val="20"/>
+          <w:szCs w:val="20"/>
+          <w14:ligatures w14:val="none"/>
+        </w:rPr>
+        <w:t>ENTER</w:t>
+      </w:r>
+      <w:r>
+        <w:rPr>
+          <w:rFonts w:ascii="Times New Roman" w:eastAsia="Times New Roman" w:hAnsi="Times New Roman" w:cs="Times New Roman"/>
+          <w:kern w:val="0"/>
+          <w14:ligatures w14:val="none"/>
+        </w:rPr>
+        <w:t xml:space="preserve"> to record for 5 seconds. Press </w:t>
+      </w:r>
+      <w:r>
+        <w:rPr>
+          <w:rFonts w:ascii="Courier New" w:eastAsia="Times New Roman" w:hAnsi="Courier New" w:cs="Courier New"/>
+          <w:kern w:val="0"/>
+          <w:sz w:val="20"/>
+          <w:szCs w:val="20"/>
+          <w14:ligatures w14:val="none"/>
+        </w:rPr>
+        <w:t>ENTER</w:t>
+      </w:r>
+      <w:r>
+        <w:rPr>
+          <w:rFonts w:ascii="Times New Roman" w:eastAsia="Times New Roman" w:hAnsi="Times New Roman" w:cs="Times New Roman"/>
+          <w:kern w:val="0"/>
+          <w14:ligatures w14:val="none"/>
+        </w:rPr>
+        <w:t xml:space="preserve"> to pause.</w:t>
+      </w:r>
+    </w:p>
+    <w:p>
+      <w:pPr>
+        <w:numPr>
+          <w:ilvl w:val="0"/>
+          <w:numId w:val="9"/>
+        </w:numPr>
+        <w:spacing w:before="100" w:beforeAutospacing="1" w:after="100" w:afterAutospacing="1" w:line="240" w:lineRule="auto"/>
+        <w:jc w:val="both"/>
+        <w:rPr>
+          <w:rFonts w:ascii="Times New Roman" w:eastAsia="Times New Roman" w:hAnsi="Times New Roman" w:cs="Times New Roman"/>
+          <w:kern w:val="0"/>
+          <w14:ligatures w14:val="none"/>
+        </w:rPr>
+      </w:pPr>
+      <w:r>
+        <w:rPr>
+          <w:rFonts w:ascii="Times New Roman" w:eastAsia="Times New Roman" w:hAnsi="Times New Roman" w:cs="Times New Roman"/>
+          <w:kern w:val="0"/>
+          <w14:ligatures w14:val="none"/>
+        </w:rPr>
+        <w:t xml:space="preserve">Tap the </w:t>
+      </w:r>
+      <w:r>
+        <w:rPr>
+          <w:rFonts w:ascii="Times New Roman" w:eastAsia="Times New Roman" w:hAnsi="Times New Roman" w:cs="Times New Roman"/>
           <w:b/>
           <w:bCs/>
-        </w:rPr>
-        <w:t>Phase 3: The "Puppeteer" Data Collection</w:t>
+          <w:kern w:val="0"/>
+          <w14:ligatures w14:val="none"/>
+        </w:rPr>
+        <w:t>Right Arrow</w:t>
+      </w:r>
+      <w:r>
+        <w:rPr>
+          <w:rFonts w:ascii="Times New Roman" w:eastAsia="Times New Roman" w:hAnsi="Times New Roman" w:cs="Times New Roman"/>
+          <w:kern w:val="0"/>
+          <w14:ligatures w14:val="none"/>
+        </w:rPr>
+        <w:t xml:space="preserve"> (</w:t>
+      </w:r>
+      <w:proofErr w:type="spellStart"/>
+      <w:r>
+        <w:rPr>
+          <w:rFonts w:ascii="Courier New" w:eastAsia="Times New Roman" w:hAnsi="Courier New" w:cs="Courier New"/>
+          <w:kern w:val="0"/>
+          <w:sz w:val="20"/>
+          <w:szCs w:val="20"/>
+          <w14:ligatures w14:val="none"/>
+        </w:rPr>
+        <w:t>TipRight</w:t>
+      </w:r>
+      <w:proofErr w:type="spellEnd"/>
+      <w:r>
+        <w:rPr>
+          <w:rFonts w:ascii="Times New Roman" w:eastAsia="Times New Roman" w:hAnsi="Times New Roman" w:cs="Times New Roman"/>
+          <w:kern w:val="0"/>
+          <w14:ligatures w14:val="none"/>
+        </w:rPr>
+        <w:t xml:space="preserve">). Hold him tilted on his right track. Press </w:t>
+      </w:r>
+      <w:r>
+        <w:rPr>
+          <w:rFonts w:ascii="Courier New" w:eastAsia="Times New Roman" w:hAnsi="Courier New" w:cs="Courier New"/>
+          <w:kern w:val="0"/>
+          <w:sz w:val="20"/>
+          <w:szCs w:val="20"/>
+          <w14:ligatures w14:val="none"/>
+        </w:rPr>
+        <w:t>ENTER</w:t>
+      </w:r>
+      <w:r>
+        <w:rPr>
+          <w:rFonts w:ascii="Times New Roman" w:eastAsia="Times New Roman" w:hAnsi="Times New Roman" w:cs="Times New Roman"/>
+          <w:kern w:val="0"/>
+          <w14:ligatures w14:val="none"/>
+        </w:rPr>
+        <w:t xml:space="preserve"> to record for 5 seconds. Press </w:t>
+      </w:r>
+      <w:r>
+        <w:rPr>
+          <w:rFonts w:ascii="Courier New" w:eastAsia="Times New Roman" w:hAnsi="Courier New" w:cs="Courier New"/>
+          <w:kern w:val="0"/>
+          <w:sz w:val="20"/>
+          <w:szCs w:val="20"/>
+          <w14:ligatures w14:val="none"/>
+        </w:rPr>
+        <w:t>ENTER</w:t>
+      </w:r>
+      <w:r>
+        <w:rPr>
+          <w:rFonts w:ascii="Times New Roman" w:eastAsia="Times New Roman" w:hAnsi="Times New Roman" w:cs="Times New Roman"/>
+          <w:kern w:val="0"/>
+          <w14:ligatures w14:val="none"/>
+        </w:rPr>
+        <w:t xml:space="preserve"> to pause.</w:t>
       </w:r>
     </w:p>
     <w:p>
-      <w:r>
-        <w:t xml:space="preserve">Now you start teaching the AI. Remember to hold the keys </w:t>
-      </w:r>
-      <w:r>
-        <w:rPr>
+      <w:pPr>
+        <w:numPr>
+          <w:ilvl w:val="0"/>
+          <w:numId w:val="9"/>
+        </w:numPr>
+        <w:spacing w:before="100" w:beforeAutospacing="1" w:after="100" w:afterAutospacing="1" w:line="240" w:lineRule="auto"/>
+        <w:jc w:val="both"/>
+        <w:rPr>
+          <w:rFonts w:ascii="Times New Roman" w:eastAsia="Times New Roman" w:hAnsi="Times New Roman" w:cs="Times New Roman"/>
+          <w:kern w:val="0"/>
+          <w14:ligatures w14:val="none"/>
+        </w:rPr>
+      </w:pPr>
+      <w:r>
+        <w:rPr>
+          <w:rFonts w:ascii="Times New Roman" w:eastAsia="Times New Roman" w:hAnsi="Times New Roman" w:cs="Times New Roman"/>
+          <w:kern w:val="0"/>
+          <w14:ligatures w14:val="none"/>
+        </w:rPr>
+        <w:t xml:space="preserve">Tap </w:t>
+      </w:r>
+      <w:r>
+        <w:rPr>
+          <w:rFonts w:ascii="Times New Roman" w:eastAsia="Times New Roman" w:hAnsi="Times New Roman" w:cs="Times New Roman"/>
           <w:b/>
           <w:bCs/>
-        </w:rPr>
-        <w:t>while</w:t>
-      </w:r>
-      <w:r>
-        <w:t xml:space="preserve"> you are performing the action, and release them the exact millisecond the action stops.</w:t>
+          <w:kern w:val="0"/>
+          <w14:ligatures w14:val="none"/>
+        </w:rPr>
+        <w:t>I</w:t>
+      </w:r>
+      <w:r>
+        <w:rPr>
+          <w:rFonts w:ascii="Times New Roman" w:eastAsia="Times New Roman" w:hAnsi="Times New Roman" w:cs="Times New Roman"/>
+          <w:kern w:val="0"/>
+          <w14:ligatures w14:val="none"/>
+        </w:rPr>
+        <w:t xml:space="preserve"> (</w:t>
+      </w:r>
+      <w:proofErr w:type="spellStart"/>
+      <w:r>
+        <w:rPr>
+          <w:rFonts w:ascii="Courier New" w:eastAsia="Times New Roman" w:hAnsi="Courier New" w:cs="Courier New"/>
+          <w:kern w:val="0"/>
+          <w:sz w:val="20"/>
+          <w:szCs w:val="20"/>
+          <w14:ligatures w14:val="none"/>
+        </w:rPr>
+        <w:t>UpsideDown</w:t>
+      </w:r>
+      <w:proofErr w:type="spellEnd"/>
+      <w:r>
+        <w:rPr>
+          <w:rFonts w:ascii="Times New Roman" w:eastAsia="Times New Roman" w:hAnsi="Times New Roman" w:cs="Times New Roman"/>
+          <w:kern w:val="0"/>
+          <w14:ligatures w14:val="none"/>
+        </w:rPr>
+        <w:t xml:space="preserve">). Flip him flat on his back. Press </w:t>
+      </w:r>
+      <w:r>
+        <w:rPr>
+          <w:rFonts w:ascii="Courier New" w:eastAsia="Times New Roman" w:hAnsi="Courier New" w:cs="Courier New"/>
+          <w:kern w:val="0"/>
+          <w:sz w:val="20"/>
+          <w:szCs w:val="20"/>
+          <w14:ligatures w14:val="none"/>
+        </w:rPr>
+        <w:t>ENTER</w:t>
+      </w:r>
+      <w:r>
+        <w:rPr>
+          <w:rFonts w:ascii="Times New Roman" w:eastAsia="Times New Roman" w:hAnsi="Times New Roman" w:cs="Times New Roman"/>
+          <w:kern w:val="0"/>
+          <w14:ligatures w14:val="none"/>
+        </w:rPr>
+        <w:t xml:space="preserve"> to record for 5 seconds. Press </w:t>
+      </w:r>
+      <w:r>
+        <w:rPr>
+          <w:rFonts w:ascii="Courier New" w:eastAsia="Times New Roman" w:hAnsi="Courier New" w:cs="Courier New"/>
+          <w:kern w:val="0"/>
+          <w:sz w:val="20"/>
+          <w:szCs w:val="20"/>
+          <w14:ligatures w14:val="none"/>
+        </w:rPr>
+        <w:t>ENTER</w:t>
+      </w:r>
+      <w:r>
+        <w:rPr>
+          <w:rFonts w:ascii="Times New Roman" w:eastAsia="Times New Roman" w:hAnsi="Times New Roman" w:cs="Times New Roman"/>
+          <w:kern w:val="0"/>
+          <w14:ligatures w14:val="none"/>
+        </w:rPr>
+        <w:t xml:space="preserve"> to pause.</w:t>
       </w:r>
     </w:p>
     <w:p>
-      <w:r>
-        <w:rPr>
+      <w:pPr>
+        <w:numPr>
+          <w:ilvl w:val="0"/>
+          <w:numId w:val="9"/>
+        </w:numPr>
+        <w:spacing w:before="100" w:beforeAutospacing="1" w:after="100" w:afterAutospacing="1" w:line="240" w:lineRule="auto"/>
+        <w:jc w:val="both"/>
+        <w:rPr>
+          <w:rFonts w:ascii="Times New Roman" w:eastAsia="Times New Roman" w:hAnsi="Times New Roman" w:cs="Times New Roman"/>
+          <w:kern w:val="0"/>
+          <w14:ligatures w14:val="none"/>
+        </w:rPr>
+      </w:pPr>
+      <w:r>
+        <w:rPr>
+          <w:rFonts w:ascii="Times New Roman" w:eastAsia="Times New Roman" w:hAnsi="Times New Roman" w:cs="Times New Roman"/>
+          <w:kern w:val="0"/>
+          <w14:ligatures w14:val="none"/>
+        </w:rPr>
+        <w:t xml:space="preserve">Tap </w:t>
+      </w:r>
+      <w:r>
+        <w:rPr>
+          <w:rFonts w:ascii="Times New Roman" w:eastAsia="Times New Roman" w:hAnsi="Times New Roman" w:cs="Times New Roman"/>
           <w:b/>
           <w:bCs/>
-        </w:rPr>
-        <w:t>6. The "Stillness" Baseline (10 seconds):</w:t>
-      </w:r>
-      <w:r>
-        <w:t xml:space="preserve"> Leave him on the floor. Do nothing. This teaches the AI what the noise floor of the MPU6500 feels like.</w:t>
+          <w:kern w:val="0"/>
+          <w14:ligatures w14:val="none"/>
+        </w:rPr>
+        <w:t>U</w:t>
+      </w:r>
+      <w:r>
+        <w:rPr>
+          <w:rFonts w:ascii="Times New Roman" w:eastAsia="Times New Roman" w:hAnsi="Times New Roman" w:cs="Times New Roman"/>
+          <w:kern w:val="0"/>
+          <w14:ligatures w14:val="none"/>
+        </w:rPr>
+        <w:t xml:space="preserve"> (</w:t>
+      </w:r>
+      <w:r>
+        <w:rPr>
+          <w:rFonts w:ascii="Courier New" w:eastAsia="Times New Roman" w:hAnsi="Courier New" w:cs="Courier New"/>
+          <w:kern w:val="0"/>
+          <w:sz w:val="20"/>
+          <w:szCs w:val="20"/>
+          <w14:ligatures w14:val="none"/>
+        </w:rPr>
+        <w:t>Upright</w:t>
+      </w:r>
+      <w:r>
+        <w:rPr>
+          <w:rFonts w:ascii="Times New Roman" w:eastAsia="Times New Roman" w:hAnsi="Times New Roman" w:cs="Times New Roman"/>
+          <w:kern w:val="0"/>
+          <w14:ligatures w14:val="none"/>
+        </w:rPr>
+        <w:t>). Return him to a level position.</w:t>
       </w:r>
     </w:p>
     <w:p>
       <w:pPr>
-        <w:rPr>
+        <w:numPr>
+          <w:ilvl w:val="0"/>
+          <w:numId w:val="9"/>
+        </w:numPr>
+        <w:spacing w:before="100" w:beforeAutospacing="1" w:after="100" w:afterAutospacing="1" w:line="240" w:lineRule="auto"/>
+        <w:jc w:val="both"/>
+        <w:rPr>
+          <w:rFonts w:ascii="Times New Roman" w:eastAsia="Times New Roman" w:hAnsi="Times New Roman" w:cs="Times New Roman"/>
+          <w:kern w:val="0"/>
+          <w14:ligatures w14:val="none"/>
+        </w:rPr>
+      </w:pPr>
+      <w:r>
+        <w:rPr>
+          <w:rFonts w:ascii="Times New Roman" w:eastAsia="Times New Roman" w:hAnsi="Times New Roman" w:cs="Times New Roman"/>
+          <w:kern w:val="0"/>
+          <w14:ligatures w14:val="none"/>
+        </w:rPr>
+        <w:t xml:space="preserve">Put him back on the floor, and press </w:t>
+      </w:r>
+      <w:r>
+        <w:rPr>
+          <w:rFonts w:ascii="Courier New" w:eastAsia="Times New Roman" w:hAnsi="Courier New" w:cs="Courier New"/>
+          <w:kern w:val="0"/>
+          <w:sz w:val="20"/>
+          <w:szCs w:val="20"/>
+          <w14:ligatures w14:val="none"/>
+        </w:rPr>
+        <w:t>SPACE</w:t>
+      </w:r>
+      <w:r>
+        <w:rPr>
+          <w:rFonts w:ascii="Times New Roman" w:eastAsia="Times New Roman" w:hAnsi="Times New Roman" w:cs="Times New Roman"/>
+          <w:kern w:val="0"/>
+          <w14:ligatures w14:val="none"/>
+        </w:rPr>
+        <w:t xml:space="preserve"> to turn </w:t>
+      </w:r>
+      <w:proofErr w:type="spellStart"/>
+      <w:r>
+        <w:rPr>
+          <w:rFonts w:ascii="Courier New" w:eastAsia="Times New Roman" w:hAnsi="Courier New" w:cs="Courier New"/>
+          <w:kern w:val="0"/>
+          <w:sz w:val="20"/>
+          <w:szCs w:val="20"/>
+          <w14:ligatures w14:val="none"/>
+        </w:rPr>
+        <w:t>isHandling</w:t>
+      </w:r>
+      <w:proofErr w:type="spellEnd"/>
+      <w:r>
+        <w:rPr>
+          <w:rFonts w:ascii="Times New Roman" w:eastAsia="Times New Roman" w:hAnsi="Times New Roman" w:cs="Times New Roman"/>
+          <w:kern w:val="0"/>
+          <w14:ligatures w14:val="none"/>
+        </w:rPr>
+        <w:t xml:space="preserve"> [OFF].</w:t>
+      </w:r>
+    </w:p>
+    <w:p>
+      <w:pPr>
+        <w:spacing w:before="100" w:beforeAutospacing="1" w:after="100" w:afterAutospacing="1" w:line="240" w:lineRule="auto"/>
+        <w:jc w:val="both"/>
+        <w:rPr>
+          <w:rFonts w:ascii="Times New Roman" w:eastAsia="Times New Roman" w:hAnsi="Times New Roman" w:cs="Times New Roman"/>
+          <w:kern w:val="0"/>
+          <w14:ligatures w14:val="none"/>
+        </w:rPr>
+      </w:pPr>
+      <w:r>
+        <w:rPr>
+          <w:rFonts w:ascii="Times New Roman" w:eastAsia="Times New Roman" w:hAnsi="Times New Roman" w:cs="Times New Roman"/>
           <w:b/>
           <w:bCs/>
-        </w:rPr>
-      </w:pPr>
-      <w:r>
-        <w:rPr>
+          <w:kern w:val="0"/>
+          <w14:ligatures w14:val="none"/>
+        </w:rPr>
+        <w:t>9. The "Interference &amp; Freefall" Drill (Safety warnings apply!):</w:t>
+      </w:r>
+    </w:p>
+    <w:p>
+      <w:pPr>
+        <w:numPr>
+          <w:ilvl w:val="0"/>
+          <w:numId w:val="10"/>
+        </w:numPr>
+        <w:spacing w:before="100" w:beforeAutospacing="1" w:after="100" w:afterAutospacing="1" w:line="240" w:lineRule="auto"/>
+        <w:jc w:val="both"/>
+        <w:rPr>
+          <w:rFonts w:ascii="Times New Roman" w:eastAsia="Times New Roman" w:hAnsi="Times New Roman" w:cs="Times New Roman"/>
+          <w:kern w:val="0"/>
+          <w14:ligatures w14:val="none"/>
+        </w:rPr>
+      </w:pPr>
+      <w:r>
+        <w:rPr>
+          <w:rFonts w:ascii="Times New Roman" w:eastAsia="Times New Roman" w:hAnsi="Times New Roman" w:cs="Times New Roman"/>
           <w:b/>
           <w:bCs/>
-        </w:rPr>
-        <w:t>7. The "Handling &amp; Orientations" Drill (2 minutes):</w:t>
+          <w:kern w:val="0"/>
+          <w14:ligatures w14:val="none"/>
+        </w:rPr>
+        <w:t>The Shove:</w:t>
+      </w:r>
+      <w:r>
+        <w:rPr>
+          <w:rFonts w:ascii="Times New Roman" w:eastAsia="Times New Roman" w:hAnsi="Times New Roman" w:cs="Times New Roman"/>
+          <w:kern w:val="0"/>
+          <w14:ligatures w14:val="none"/>
+        </w:rPr>
+        <w:t xml:space="preserve"> Drive him slowly across the floor. Press </w:t>
+      </w:r>
+      <w:r>
+        <w:rPr>
+          <w:rFonts w:ascii="Courier New" w:eastAsia="Times New Roman" w:hAnsi="Courier New" w:cs="Courier New"/>
+          <w:kern w:val="0"/>
+          <w:sz w:val="20"/>
+          <w:szCs w:val="20"/>
+          <w14:ligatures w14:val="none"/>
+        </w:rPr>
+        <w:t>ENTER</w:t>
+      </w:r>
+      <w:r>
+        <w:rPr>
+          <w:rFonts w:ascii="Times New Roman" w:eastAsia="Times New Roman" w:hAnsi="Times New Roman" w:cs="Times New Roman"/>
+          <w:kern w:val="0"/>
+          <w14:ligatures w14:val="none"/>
+        </w:rPr>
+        <w:t xml:space="preserve"> to start recording. Forcefully push him from the side with your foot or hand so he slides. Hold </w:t>
+      </w:r>
+      <w:r>
+        <w:rPr>
+          <w:rFonts w:ascii="Courier New" w:eastAsia="Times New Roman" w:hAnsi="Courier New" w:cs="Courier New"/>
+          <w:kern w:val="0"/>
+          <w:sz w:val="20"/>
+          <w:szCs w:val="20"/>
+          <w14:ligatures w14:val="none"/>
+        </w:rPr>
+        <w:t>Q</w:t>
+      </w:r>
+      <w:r>
+        <w:rPr>
+          <w:rFonts w:ascii="Times New Roman" w:eastAsia="Times New Roman" w:hAnsi="Times New Roman" w:cs="Times New Roman"/>
+          <w:kern w:val="0"/>
+          <w14:ligatures w14:val="none"/>
+        </w:rPr>
+        <w:t xml:space="preserve"> (</w:t>
+      </w:r>
+      <w:proofErr w:type="spellStart"/>
+      <w:r>
+        <w:rPr>
+          <w:rFonts w:ascii="Courier New" w:eastAsia="Times New Roman" w:hAnsi="Courier New" w:cs="Courier New"/>
+          <w:kern w:val="0"/>
+          <w:sz w:val="20"/>
+          <w:szCs w:val="20"/>
+          <w14:ligatures w14:val="none"/>
+        </w:rPr>
+        <w:t>isBeingPushed</w:t>
+      </w:r>
+      <w:proofErr w:type="spellEnd"/>
+      <w:r>
+        <w:rPr>
+          <w:rFonts w:ascii="Times New Roman" w:eastAsia="Times New Roman" w:hAnsi="Times New Roman" w:cs="Times New Roman"/>
+          <w:kern w:val="0"/>
+          <w14:ligatures w14:val="none"/>
+        </w:rPr>
+        <w:t xml:space="preserve">) during the slide. Let go of </w:t>
+      </w:r>
+      <w:r>
+        <w:rPr>
+          <w:rFonts w:ascii="Courier New" w:eastAsia="Times New Roman" w:hAnsi="Courier New" w:cs="Courier New"/>
+          <w:kern w:val="0"/>
+          <w:sz w:val="20"/>
+          <w:szCs w:val="20"/>
+          <w14:ligatures w14:val="none"/>
+        </w:rPr>
+        <w:t>Q</w:t>
+      </w:r>
+      <w:r>
+        <w:rPr>
+          <w:rFonts w:ascii="Times New Roman" w:eastAsia="Times New Roman" w:hAnsi="Times New Roman" w:cs="Times New Roman"/>
+          <w:kern w:val="0"/>
+          <w14:ligatures w14:val="none"/>
+        </w:rPr>
+        <w:t xml:space="preserve">. Press </w:t>
+      </w:r>
+      <w:r>
+        <w:rPr>
+          <w:rFonts w:ascii="Courier New" w:eastAsia="Times New Roman" w:hAnsi="Courier New" w:cs="Courier New"/>
+          <w:kern w:val="0"/>
+          <w:sz w:val="20"/>
+          <w:szCs w:val="20"/>
+          <w14:ligatures w14:val="none"/>
+        </w:rPr>
+        <w:t>ENTER</w:t>
+      </w:r>
+      <w:r>
+        <w:rPr>
+          <w:rFonts w:ascii="Times New Roman" w:eastAsia="Times New Roman" w:hAnsi="Times New Roman" w:cs="Times New Roman"/>
+          <w:kern w:val="0"/>
+          <w14:ligatures w14:val="none"/>
+        </w:rPr>
+        <w:t xml:space="preserve"> to pause.</w:t>
       </w:r>
     </w:p>
     <w:p>
-      <w:r>
-        <w:t xml:space="preserve">You will tap SPACE once, pick Mister Mischief up, </w:t>
-      </w:r>
-      <w:r>
-        <w:t>b</w:t>
-      </w:r>
-      <w:r>
-        <w:t xml:space="preserve">ecause the Orientations are "Sticky" (they stay on until you press another one), change your choreography. </w:t>
-      </w:r>
-      <w:r>
-        <w:rPr>
+      <w:pPr>
+        <w:numPr>
+          <w:ilvl w:val="0"/>
+          <w:numId w:val="10"/>
+        </w:numPr>
+        <w:spacing w:before="100" w:beforeAutospacing="1" w:after="100" w:afterAutospacing="1" w:line="240" w:lineRule="auto"/>
+        <w:jc w:val="both"/>
+        <w:rPr>
+          <w:rFonts w:ascii="Times New Roman" w:eastAsia="Times New Roman" w:hAnsi="Times New Roman" w:cs="Times New Roman"/>
+          <w:kern w:val="0"/>
+          <w14:ligatures w14:val="none"/>
+        </w:rPr>
+      </w:pPr>
+      <w:r>
+        <w:rPr>
+          <w:rFonts w:ascii="Times New Roman" w:eastAsia="Times New Roman" w:hAnsi="Times New Roman" w:cs="Times New Roman"/>
           <w:b/>
           <w:bCs/>
-        </w:rPr>
-        <w:t>Tap the arrow key FIRST with one hand</w:t>
-      </w:r>
-      <w:r>
-        <w:t xml:space="preserve">, and </w:t>
-      </w:r>
-      <w:r>
-        <w:rPr>
-          <w:i/>
-          <w:iCs/>
-        </w:rPr>
-        <w:t>then</w:t>
-      </w:r>
-      <w:r>
-        <w:t xml:space="preserve"> use both hands to physically flip him onto his side. Wait 5 seconds. Put him down. Tap the next key. Move him again.</w:t>
-      </w:r>
-      <w:r>
-        <w:t>, and then tap SPACE again when you place him back down</w:t>
-      </w:r>
-      <w:r>
-        <w:t xml:space="preserve"> t</w:t>
-      </w:r>
-      <w:r>
-        <w:t>o release the sticky and end the sequence.</w:t>
-      </w:r>
-      <w:r>
-        <w:t>.</w:t>
+          <w:kern w:val="0"/>
+          <w14:ligatures w14:val="none"/>
+        </w:rPr>
+        <w:t>The Tease:</w:t>
+      </w:r>
+      <w:r>
+        <w:rPr>
+          <w:rFonts w:ascii="Times New Roman" w:eastAsia="Times New Roman" w:hAnsi="Times New Roman" w:cs="Times New Roman"/>
+          <w:kern w:val="0"/>
+          <w14:ligatures w14:val="none"/>
+        </w:rPr>
+        <w:t xml:space="preserve"> Leave him completely still. Press </w:t>
+      </w:r>
+      <w:r>
+        <w:rPr>
+          <w:rFonts w:ascii="Courier New" w:eastAsia="Times New Roman" w:hAnsi="Courier New" w:cs="Courier New"/>
+          <w:kern w:val="0"/>
+          <w:sz w:val="20"/>
+          <w:szCs w:val="20"/>
+          <w14:ligatures w14:val="none"/>
+        </w:rPr>
+        <w:t>ENTER</w:t>
+      </w:r>
+      <w:r>
+        <w:rPr>
+          <w:rFonts w:ascii="Times New Roman" w:eastAsia="Times New Roman" w:hAnsi="Times New Roman" w:cs="Times New Roman"/>
+          <w:kern w:val="0"/>
+          <w14:ligatures w14:val="none"/>
+        </w:rPr>
+        <w:t xml:space="preserve"> to start recording. Rapidly wave your hand in and out of the Sonar's range at different distances while holding </w:t>
+      </w:r>
+      <w:r>
+        <w:rPr>
+          <w:rFonts w:ascii="Courier New" w:eastAsia="Times New Roman" w:hAnsi="Courier New" w:cs="Courier New"/>
+          <w:kern w:val="0"/>
+          <w:sz w:val="20"/>
+          <w:szCs w:val="20"/>
+          <w14:ligatures w14:val="none"/>
+        </w:rPr>
+        <w:t>E</w:t>
+      </w:r>
+      <w:r>
+        <w:rPr>
+          <w:rFonts w:ascii="Times New Roman" w:eastAsia="Times New Roman" w:hAnsi="Times New Roman" w:cs="Times New Roman"/>
+          <w:kern w:val="0"/>
+          <w14:ligatures w14:val="none"/>
+        </w:rPr>
+        <w:t xml:space="preserve"> (</w:t>
+      </w:r>
+      <w:proofErr w:type="spellStart"/>
+      <w:r>
+        <w:rPr>
+          <w:rFonts w:ascii="Courier New" w:eastAsia="Times New Roman" w:hAnsi="Courier New" w:cs="Courier New"/>
+          <w:kern w:val="0"/>
+          <w:sz w:val="20"/>
+          <w:szCs w:val="20"/>
+          <w14:ligatures w14:val="none"/>
+        </w:rPr>
+        <w:t>isBeingTeased</w:t>
+      </w:r>
+      <w:proofErr w:type="spellEnd"/>
+      <w:r>
+        <w:rPr>
+          <w:rFonts w:ascii="Times New Roman" w:eastAsia="Times New Roman" w:hAnsi="Times New Roman" w:cs="Times New Roman"/>
+          <w:kern w:val="0"/>
+          <w14:ligatures w14:val="none"/>
+        </w:rPr>
+        <w:t xml:space="preserve">). Release </w:t>
+      </w:r>
+      <w:r>
+        <w:rPr>
+          <w:rFonts w:ascii="Courier New" w:eastAsia="Times New Roman" w:hAnsi="Courier New" w:cs="Courier New"/>
+          <w:kern w:val="0"/>
+          <w:sz w:val="20"/>
+          <w:szCs w:val="20"/>
+          <w14:ligatures w14:val="none"/>
+        </w:rPr>
+        <w:t>E</w:t>
+      </w:r>
+      <w:r>
+        <w:rPr>
+          <w:rFonts w:ascii="Times New Roman" w:eastAsia="Times New Roman" w:hAnsi="Times New Roman" w:cs="Times New Roman"/>
+          <w:kern w:val="0"/>
+          <w14:ligatures w14:val="none"/>
+        </w:rPr>
+        <w:t xml:space="preserve">. Press </w:t>
+      </w:r>
+      <w:r>
+        <w:rPr>
+          <w:rFonts w:ascii="Courier New" w:eastAsia="Times New Roman" w:hAnsi="Courier New" w:cs="Courier New"/>
+          <w:kern w:val="0"/>
+          <w:sz w:val="20"/>
+          <w:szCs w:val="20"/>
+          <w14:ligatures w14:val="none"/>
+        </w:rPr>
+        <w:t>ENTER</w:t>
+      </w:r>
+      <w:r>
+        <w:rPr>
+          <w:rFonts w:ascii="Times New Roman" w:eastAsia="Times New Roman" w:hAnsi="Times New Roman" w:cs="Times New Roman"/>
+          <w:kern w:val="0"/>
+          <w14:ligatures w14:val="none"/>
+        </w:rPr>
+        <w:t xml:space="preserve"> to pause.</w:t>
       </w:r>
     </w:p>
     <w:p>
-      <w:r>
-        <w:t>The other action keys (W, Q, E, R, F) will remain Momentary (hold-to-activate), because you only need one hand to push him or drop him while your other hand holds the key.</w:t>
+      <w:pPr>
+        <w:numPr>
+          <w:ilvl w:val="0"/>
+          <w:numId w:val="10"/>
+        </w:numPr>
+        <w:spacing w:before="100" w:beforeAutospacing="1" w:after="100" w:afterAutospacing="1" w:line="240" w:lineRule="auto"/>
+        <w:jc w:val="both"/>
+        <w:rPr>
+          <w:rFonts w:ascii="Times New Roman" w:eastAsia="Times New Roman" w:hAnsi="Times New Roman" w:cs="Times New Roman"/>
+          <w:kern w:val="0"/>
+          <w14:ligatures w14:val="none"/>
+        </w:rPr>
+      </w:pPr>
+      <w:r>
+        <w:rPr>
+          <w:rFonts w:ascii="Times New Roman" w:eastAsia="Times New Roman" w:hAnsi="Times New Roman" w:cs="Times New Roman"/>
+          <w:b/>
+          <w:bCs/>
+          <w:kern w:val="0"/>
+          <w14:ligatures w14:val="none"/>
+        </w:rPr>
+        <w:t>The Drop:</w:t>
+      </w:r>
+      <w:r>
+        <w:rPr>
+          <w:rFonts w:ascii="Times New Roman" w:eastAsia="Times New Roman" w:hAnsi="Times New Roman" w:cs="Times New Roman"/>
+          <w:kern w:val="0"/>
+          <w14:ligatures w14:val="none"/>
+        </w:rPr>
+        <w:t xml:space="preserve"> Hold him about 5 inches over a soft bed or cushion. Tap </w:t>
+      </w:r>
+      <w:r>
+        <w:rPr>
+          <w:rFonts w:ascii="Courier New" w:eastAsia="Times New Roman" w:hAnsi="Courier New" w:cs="Courier New"/>
+          <w:kern w:val="0"/>
+          <w:sz w:val="20"/>
+          <w:szCs w:val="20"/>
+          <w14:ligatures w14:val="none"/>
+        </w:rPr>
+        <w:t>SPACE</w:t>
+      </w:r>
+      <w:r>
+        <w:rPr>
+          <w:rFonts w:ascii="Times New Roman" w:eastAsia="Times New Roman" w:hAnsi="Times New Roman" w:cs="Times New Roman"/>
+          <w:kern w:val="0"/>
+          <w14:ligatures w14:val="none"/>
+        </w:rPr>
+        <w:t xml:space="preserve"> to turn </w:t>
+      </w:r>
+      <w:proofErr w:type="spellStart"/>
+      <w:r>
+        <w:rPr>
+          <w:rFonts w:ascii="Courier New" w:eastAsia="Times New Roman" w:hAnsi="Courier New" w:cs="Courier New"/>
+          <w:kern w:val="0"/>
+          <w:sz w:val="20"/>
+          <w:szCs w:val="20"/>
+          <w14:ligatures w14:val="none"/>
+        </w:rPr>
+        <w:t>isHandling</w:t>
+      </w:r>
+      <w:proofErr w:type="spellEnd"/>
+      <w:r>
+        <w:rPr>
+          <w:rFonts w:ascii="Times New Roman" w:eastAsia="Times New Roman" w:hAnsi="Times New Roman" w:cs="Times New Roman"/>
+          <w:kern w:val="0"/>
+          <w14:ligatures w14:val="none"/>
+        </w:rPr>
+        <w:t xml:space="preserve"> [ON]. Press </w:t>
+      </w:r>
+      <w:r>
+        <w:rPr>
+          <w:rFonts w:ascii="Courier New" w:eastAsia="Times New Roman" w:hAnsi="Courier New" w:cs="Courier New"/>
+          <w:kern w:val="0"/>
+          <w:sz w:val="20"/>
+          <w:szCs w:val="20"/>
+          <w14:ligatures w14:val="none"/>
+        </w:rPr>
+        <w:t>ENTER</w:t>
+      </w:r>
+      <w:r>
+        <w:rPr>
+          <w:rFonts w:ascii="Times New Roman" w:eastAsia="Times New Roman" w:hAnsi="Times New Roman" w:cs="Times New Roman"/>
+          <w:kern w:val="0"/>
+          <w14:ligatures w14:val="none"/>
+        </w:rPr>
+        <w:t xml:space="preserve"> to start recording. Drop him. The instant he is in the air, press and hold </w:t>
+      </w:r>
+      <w:r>
+        <w:rPr>
+          <w:rFonts w:ascii="Courier New" w:eastAsia="Times New Roman" w:hAnsi="Courier New" w:cs="Courier New"/>
+          <w:kern w:val="0"/>
+          <w:sz w:val="20"/>
+          <w:szCs w:val="20"/>
+          <w14:ligatures w14:val="none"/>
+        </w:rPr>
+        <w:t>F</w:t>
+      </w:r>
+      <w:r>
+        <w:rPr>
+          <w:rFonts w:ascii="Times New Roman" w:eastAsia="Times New Roman" w:hAnsi="Times New Roman" w:cs="Times New Roman"/>
+          <w:kern w:val="0"/>
+          <w14:ligatures w14:val="none"/>
+        </w:rPr>
+        <w:t xml:space="preserve"> (</w:t>
+      </w:r>
+      <w:proofErr w:type="spellStart"/>
+      <w:r>
+        <w:rPr>
+          <w:rFonts w:ascii="Courier New" w:eastAsia="Times New Roman" w:hAnsi="Courier New" w:cs="Courier New"/>
+          <w:kern w:val="0"/>
+          <w:sz w:val="20"/>
+          <w:szCs w:val="20"/>
+          <w14:ligatures w14:val="none"/>
+        </w:rPr>
+        <w:t>isFreeFalling</w:t>
+      </w:r>
+      <w:proofErr w:type="spellEnd"/>
+      <w:r>
+        <w:rPr>
+          <w:rFonts w:ascii="Times New Roman" w:eastAsia="Times New Roman" w:hAnsi="Times New Roman" w:cs="Times New Roman"/>
+          <w:kern w:val="0"/>
+          <w14:ligatures w14:val="none"/>
+        </w:rPr>
+        <w:t xml:space="preserve">). The instant he hits the </w:t>
+      </w:r>
+      <w:proofErr w:type="gramStart"/>
+      <w:r>
+        <w:rPr>
+          <w:rFonts w:ascii="Times New Roman" w:eastAsia="Times New Roman" w:hAnsi="Times New Roman" w:cs="Times New Roman"/>
+          <w:kern w:val="0"/>
+          <w14:ligatures w14:val="none"/>
+        </w:rPr>
+        <w:t>bed,</w:t>
+      </w:r>
+      <w:proofErr w:type="gramEnd"/>
+      <w:r>
+        <w:rPr>
+          <w:rFonts w:ascii="Times New Roman" w:eastAsia="Times New Roman" w:hAnsi="Times New Roman" w:cs="Times New Roman"/>
+          <w:kern w:val="0"/>
+          <w14:ligatures w14:val="none"/>
+        </w:rPr>
+        <w:t xml:space="preserve"> release </w:t>
+      </w:r>
+      <w:r>
+        <w:rPr>
+          <w:rFonts w:ascii="Courier New" w:eastAsia="Times New Roman" w:hAnsi="Courier New" w:cs="Courier New"/>
+          <w:kern w:val="0"/>
+          <w:sz w:val="20"/>
+          <w:szCs w:val="20"/>
+          <w14:ligatures w14:val="none"/>
+        </w:rPr>
+        <w:t>F</w:t>
+      </w:r>
+      <w:r>
+        <w:rPr>
+          <w:rFonts w:ascii="Times New Roman" w:eastAsia="Times New Roman" w:hAnsi="Times New Roman" w:cs="Times New Roman"/>
+          <w:kern w:val="0"/>
+          <w14:ligatures w14:val="none"/>
+        </w:rPr>
+        <w:t xml:space="preserve">. Press </w:t>
+      </w:r>
+      <w:r>
+        <w:rPr>
+          <w:rFonts w:ascii="Courier New" w:eastAsia="Times New Roman" w:hAnsi="Courier New" w:cs="Courier New"/>
+          <w:kern w:val="0"/>
+          <w:sz w:val="20"/>
+          <w:szCs w:val="20"/>
+          <w14:ligatures w14:val="none"/>
+        </w:rPr>
+        <w:t>ENTER</w:t>
+      </w:r>
+      <w:r>
+        <w:rPr>
+          <w:rFonts w:ascii="Times New Roman" w:eastAsia="Times New Roman" w:hAnsi="Times New Roman" w:cs="Times New Roman"/>
+          <w:kern w:val="0"/>
+          <w14:ligatures w14:val="none"/>
+        </w:rPr>
+        <w:t xml:space="preserve"> to pause. Tap </w:t>
+      </w:r>
+      <w:r>
+        <w:rPr>
+          <w:rFonts w:ascii="Courier New" w:eastAsia="Times New Roman" w:hAnsi="Courier New" w:cs="Courier New"/>
+          <w:kern w:val="0"/>
+          <w:sz w:val="20"/>
+          <w:szCs w:val="20"/>
+          <w14:ligatures w14:val="none"/>
+        </w:rPr>
+        <w:t>SPACE</w:t>
+      </w:r>
+      <w:r>
+        <w:rPr>
+          <w:rFonts w:ascii="Times New Roman" w:eastAsia="Times New Roman" w:hAnsi="Times New Roman" w:cs="Times New Roman"/>
+          <w:kern w:val="0"/>
+          <w14:ligatures w14:val="none"/>
+        </w:rPr>
+        <w:t xml:space="preserve"> to turn </w:t>
+      </w:r>
+      <w:proofErr w:type="spellStart"/>
+      <w:r>
+        <w:rPr>
+          <w:rFonts w:ascii="Courier New" w:eastAsia="Times New Roman" w:hAnsi="Courier New" w:cs="Courier New"/>
+          <w:kern w:val="0"/>
+          <w:sz w:val="20"/>
+          <w:szCs w:val="20"/>
+          <w14:ligatures w14:val="none"/>
+        </w:rPr>
+        <w:t>isHandling</w:t>
+      </w:r>
+      <w:proofErr w:type="spellEnd"/>
+      <w:r>
+        <w:rPr>
+          <w:rFonts w:ascii="Times New Roman" w:eastAsia="Times New Roman" w:hAnsi="Times New Roman" w:cs="Times New Roman"/>
+          <w:kern w:val="0"/>
+          <w14:ligatures w14:val="none"/>
+        </w:rPr>
+        <w:t xml:space="preserve"> [OFF].</w:t>
       </w:r>
     </w:p>
     <w:p>
       <w:pPr>
-        <w:numPr>
-          <w:ilvl w:val="0"/>
-          <w:numId w:val="2"/>
-        </w:numPr>
-      </w:pPr>
-      <w:r>
-        <w:t>Press SPACE (</w:t>
-      </w:r>
-      <w:proofErr w:type="spellStart"/>
-      <w:r>
-        <w:t>isHandling</w:t>
-      </w:r>
-      <w:proofErr w:type="spellEnd"/>
-      <w:r>
-        <w:t>)</w:t>
-      </w:r>
-      <w:r>
-        <w:t xml:space="preserve"> (sticky)</w:t>
-      </w:r>
-      <w:r>
-        <w:t>.</w:t>
+        <w:spacing w:before="100" w:beforeAutospacing="1" w:after="100" w:afterAutospacing="1" w:line="240" w:lineRule="auto"/>
+        <w:jc w:val="both"/>
+        <w:outlineLvl w:val="3"/>
+        <w:rPr>
+          <w:rFonts w:ascii="Times New Roman" w:eastAsia="Times New Roman" w:hAnsi="Times New Roman" w:cs="Times New Roman"/>
+          <w:b/>
+          <w:bCs/>
+          <w:kern w:val="0"/>
+          <w14:ligatures w14:val="none"/>
+        </w:rPr>
+      </w:pPr>
+      <w:r>
+        <w:rPr>
+          <w:rFonts w:ascii="Times New Roman" w:eastAsia="Times New Roman" w:hAnsi="Times New Roman" w:cs="Times New Roman"/>
+          <w:b/>
+          <w:bCs/>
+          <w:kern w:val="0"/>
+          <w14:ligatures w14:val="none"/>
+        </w:rPr>
+        <w:t>Phase 4: Shutdown</w:t>
       </w:r>
     </w:p>
     <w:p>
       <w:pPr>
-        <w:numPr>
-          <w:ilvl w:val="0"/>
-          <w:numId w:val="2"/>
-        </w:numPr>
-      </w:pPr>
-      <w:r>
-        <w:t>Pick him up.</w:t>
+        <w:spacing w:before="100" w:beforeAutospacing="1" w:after="100" w:afterAutospacing="1" w:line="240" w:lineRule="auto"/>
+        <w:jc w:val="both"/>
+        <w:rPr>
+          <w:rFonts w:ascii="Times New Roman" w:eastAsia="Times New Roman" w:hAnsi="Times New Roman" w:cs="Times New Roman"/>
+          <w:kern w:val="0"/>
+          <w14:ligatures w14:val="none"/>
+        </w:rPr>
+      </w:pPr>
+      <w:r>
+        <w:rPr>
+          <w:rFonts w:ascii="Times New Roman" w:eastAsia="Times New Roman" w:hAnsi="Times New Roman" w:cs="Times New Roman"/>
+          <w:b/>
+          <w:bCs/>
+          <w:kern w:val="0"/>
+          <w14:ligatures w14:val="none"/>
+        </w:rPr>
+        <w:t>10. Stop the Script:</w:t>
+      </w:r>
+      <w:r>
+        <w:rPr>
+          <w:rFonts w:ascii="Times New Roman" w:eastAsia="Times New Roman" w:hAnsi="Times New Roman" w:cs="Times New Roman"/>
+          <w:kern w:val="0"/>
+          <w14:ligatures w14:val="none"/>
+        </w:rPr>
+        <w:t xml:space="preserve"> Click your PC terminal and press </w:t>
+      </w:r>
+      <w:proofErr w:type="spellStart"/>
+      <w:r>
+        <w:rPr>
+          <w:rFonts w:ascii="Courier New" w:eastAsia="Times New Roman" w:hAnsi="Courier New" w:cs="Courier New"/>
+          <w:kern w:val="0"/>
+          <w:sz w:val="20"/>
+          <w:szCs w:val="20"/>
+          <w14:ligatures w14:val="none"/>
+        </w:rPr>
+        <w:t>Ctrl+C</w:t>
+      </w:r>
+      <w:proofErr w:type="spellEnd"/>
+      <w:r>
+        <w:rPr>
+          <w:rFonts w:ascii="Times New Roman" w:eastAsia="Times New Roman" w:hAnsi="Times New Roman" w:cs="Times New Roman"/>
+          <w:kern w:val="0"/>
+          <w14:ligatures w14:val="none"/>
+        </w:rPr>
+        <w:t>. The script will catch the keyboard interrupt, stop the BLE notifications, and exit gracefully.</w:t>
       </w:r>
     </w:p>
     <w:p>
       <w:pPr>
-        <w:numPr>
-          <w:ilvl w:val="0"/>
-          <w:numId w:val="2"/>
-        </w:numPr>
-      </w:pPr>
-      <w:r>
-        <w:t>Tap Left Arrow (</w:t>
-      </w:r>
-      <w:proofErr w:type="spellStart"/>
-      <w:r>
-        <w:t>TipLeft</w:t>
-      </w:r>
-      <w:proofErr w:type="spellEnd"/>
-      <w:r>
-        <w:t>). Hold him on his side for 5 seconds.</w:t>
+        <w:spacing w:before="100" w:beforeAutospacing="1" w:after="100" w:afterAutospacing="1" w:line="240" w:lineRule="auto"/>
+        <w:jc w:val="both"/>
+        <w:rPr>
+          <w:rFonts w:ascii="Times New Roman" w:eastAsia="Times New Roman" w:hAnsi="Times New Roman" w:cs="Times New Roman"/>
+          <w:kern w:val="0"/>
+          <w14:ligatures w14:val="none"/>
+        </w:rPr>
+      </w:pPr>
+      <w:r>
+        <w:rPr>
+          <w:rFonts w:ascii="Times New Roman" w:eastAsia="Times New Roman" w:hAnsi="Times New Roman" w:cs="Times New Roman"/>
+          <w:kern w:val="0"/>
+          <w14:ligatures w14:val="none"/>
+        </w:rPr>
+        <w:t xml:space="preserve">Your </w:t>
+      </w:r>
+      <w:r>
+        <w:rPr>
+          <w:rFonts w:ascii="Courier New" w:eastAsia="Times New Roman" w:hAnsi="Courier New" w:cs="Courier New"/>
+          <w:kern w:val="0"/>
+          <w:sz w:val="20"/>
+          <w:szCs w:val="20"/>
+          <w14:ligatures w14:val="none"/>
+        </w:rPr>
+        <w:t>pristine_ai_data.csv</w:t>
+      </w:r>
+      <w:r>
+        <w:rPr>
+          <w:rFonts w:ascii="Times New Roman" w:eastAsia="Times New Roman" w:hAnsi="Times New Roman" w:cs="Times New Roman"/>
+          <w:kern w:val="0"/>
+          <w14:ligatures w14:val="none"/>
+        </w:rPr>
+        <w:t xml:space="preserve"> is now safely saved to your hard drive, packed with perfectly synchronized 100Hz motor, IMU, and sonar data that maps directly to the physical realities of the robot.</w:t>
       </w:r>
     </w:p>
     <w:p>
       <w:pPr>
-        <w:numPr>
-          <w:ilvl w:val="0"/>
-          <w:numId w:val="2"/>
-        </w:numPr>
-      </w:pPr>
-      <w:r>
-        <w:t>Tap Right Arrow (</w:t>
-      </w:r>
-      <w:proofErr w:type="spellStart"/>
-      <w:r>
-        <w:t>TipRight</w:t>
-      </w:r>
-      <w:proofErr w:type="spellEnd"/>
-      <w:r>
-        <w:t>). Hold him on his other side for 5 seconds.</w:t>
-      </w:r>
-    </w:p>
-    <w:p>
-      <w:pPr>
-        <w:numPr>
-          <w:ilvl w:val="0"/>
-          <w:numId w:val="2"/>
-        </w:numPr>
-      </w:pPr>
-      <w:r>
-        <w:t>Tap I (</w:t>
-      </w:r>
-      <w:proofErr w:type="spellStart"/>
-      <w:r>
-        <w:t>UpsideDown</w:t>
-      </w:r>
-      <w:proofErr w:type="spellEnd"/>
-      <w:r>
-        <w:t>). Flip him flat on his back in the air.</w:t>
-      </w:r>
-    </w:p>
-    <w:p>
-      <w:pPr>
-        <w:numPr>
-          <w:ilvl w:val="0"/>
-          <w:numId w:val="2"/>
-        </w:numPr>
-      </w:pPr>
-      <w:r>
-        <w:t>Tap U (Upright). Return him to a level position.</w:t>
-      </w:r>
-    </w:p>
-    <w:p>
-      <w:pPr>
-        <w:numPr>
-          <w:ilvl w:val="0"/>
-          <w:numId w:val="2"/>
-        </w:numPr>
-      </w:pPr>
-      <w:r>
-        <w:t xml:space="preserve">Put him back on the floor, and </w:t>
-      </w:r>
-      <w:r>
-        <w:t>press</w:t>
-      </w:r>
-      <w:r>
-        <w:t xml:space="preserve"> SPACE</w:t>
-      </w:r>
-      <w:r>
-        <w:t xml:space="preserve"> to </w:t>
-      </w:r>
-      <w:r>
-        <w:t xml:space="preserve">stop this sequence and </w:t>
-      </w:r>
-      <w:r>
-        <w:t>release the sticky</w:t>
-      </w:r>
-      <w:r>
-        <w:t>.</w:t>
-      </w:r>
-    </w:p>
-    <w:p>
-      <w:r>
-        <w:rPr>
-          <w:b/>
-          <w:bCs/>
-        </w:rPr>
-        <w:t>8. The "Teasing" Drill (1 minute):</w:t>
-      </w:r>
-    </w:p>
-    <w:p>
-      <w:pPr>
-        <w:numPr>
-          <w:ilvl w:val="0"/>
-          <w:numId w:val="3"/>
-        </w:numPr>
-      </w:pPr>
-      <w:r>
-        <w:t xml:space="preserve">Press and hold SHIFT (turns </w:t>
-      </w:r>
-      <w:r>
-        <w:rPr>
-          <w:i/>
-          <w:iCs/>
-        </w:rPr>
-        <w:t>off</w:t>
-      </w:r>
-      <w:r>
-        <w:t xml:space="preserve"> </w:t>
-      </w:r>
-      <w:proofErr w:type="spellStart"/>
-      <w:r>
-        <w:t>isAbsolutelyStill</w:t>
-      </w:r>
-      <w:proofErr w:type="spellEnd"/>
-      <w:r>
-        <w:t>, meaning dynamic movement).</w:t>
-      </w:r>
-    </w:p>
-    <w:p>
-      <w:pPr>
-        <w:numPr>
-          <w:ilvl w:val="0"/>
-          <w:numId w:val="3"/>
-        </w:numPr>
-      </w:pPr>
-      <w:r>
-        <w:t>Press and hold E (</w:t>
-      </w:r>
-      <w:proofErr w:type="spellStart"/>
-      <w:r>
-        <w:t>isBeingTeased</w:t>
-      </w:r>
-      <w:proofErr w:type="spellEnd"/>
-      <w:r>
-        <w:t>).</w:t>
-      </w:r>
-    </w:p>
-    <w:p>
-      <w:pPr>
-        <w:numPr>
-          <w:ilvl w:val="0"/>
-          <w:numId w:val="3"/>
-        </w:numPr>
-      </w:pPr>
-      <w:r>
-        <w:t>Rapidly wave your hand in and out of the Sonar's range at different distances.</w:t>
-      </w:r>
-    </w:p>
-    <w:p>
-      <w:pPr>
-        <w:numPr>
-          <w:ilvl w:val="0"/>
-          <w:numId w:val="3"/>
-        </w:numPr>
-      </w:pPr>
-      <w:r>
-        <w:t>Release E and SHIFT.</w:t>
-      </w:r>
-    </w:p>
-    <w:p>
-      <w:r>
-        <w:rPr>
-          <w:b/>
-          <w:bCs/>
-        </w:rPr>
-        <w:lastRenderedPageBreak/>
-        <w:t>9. The "Pushed &amp; Freefall" Drill (Safety warnings apply!):</w:t>
-      </w:r>
-    </w:p>
-    <w:p>
-      <w:pPr>
-        <w:numPr>
-          <w:ilvl w:val="0"/>
-          <w:numId w:val="4"/>
-        </w:numPr>
-      </w:pPr>
-      <w:r>
-        <w:t>Press and hold Q (</w:t>
-      </w:r>
-      <w:proofErr w:type="spellStart"/>
-      <w:r>
-        <w:t>isBeingPushed</w:t>
-      </w:r>
-      <w:proofErr w:type="spellEnd"/>
-      <w:r>
-        <w:t>). Push him across the floor like a toy car. Release Q.</w:t>
-      </w:r>
-    </w:p>
-    <w:p>
-      <w:pPr>
-        <w:numPr>
-          <w:ilvl w:val="0"/>
-          <w:numId w:val="4"/>
-        </w:numPr>
-      </w:pPr>
-      <w:r>
-        <w:t xml:space="preserve">Tap SPACE to turn </w:t>
-      </w:r>
-      <w:proofErr w:type="spellStart"/>
-      <w:r>
-        <w:t>isH</w:t>
-      </w:r>
-      <w:r>
-        <w:t>andling</w:t>
-      </w:r>
-      <w:proofErr w:type="spellEnd"/>
-      <w:r>
-        <w:t xml:space="preserve"> ON</w:t>
-      </w:r>
-      <w:r>
-        <w:t>. Lift him about 5 inches off the ground (over something soft, like a bed).</w:t>
-      </w:r>
-    </w:p>
-    <w:p>
-      <w:pPr>
-        <w:numPr>
-          <w:ilvl w:val="0"/>
-          <w:numId w:val="4"/>
-        </w:numPr>
-      </w:pPr>
-      <w:r>
-        <w:t>Press and hold F (</w:t>
-      </w:r>
-      <w:proofErr w:type="spellStart"/>
-      <w:r>
-        <w:t>isFreeFalling</w:t>
-      </w:r>
-      <w:proofErr w:type="spellEnd"/>
-      <w:r>
-        <w:t>).</w:t>
-      </w:r>
-    </w:p>
-    <w:p>
-      <w:pPr>
-        <w:numPr>
-          <w:ilvl w:val="0"/>
-          <w:numId w:val="4"/>
-        </w:numPr>
-      </w:pPr>
-      <w:r>
-        <w:rPr>
-          <w:b/>
-          <w:bCs/>
-        </w:rPr>
-        <w:t>Drop him.</w:t>
-      </w:r>
-    </w:p>
-    <w:p>
-      <w:pPr>
-        <w:numPr>
-          <w:ilvl w:val="0"/>
-          <w:numId w:val="4"/>
-        </w:numPr>
-      </w:pPr>
-      <w:r>
-        <w:t xml:space="preserve">The instant he hits the bed, release F. Tap SPACE to turn </w:t>
-      </w:r>
-      <w:proofErr w:type="spellStart"/>
-      <w:r>
-        <w:t>isH</w:t>
-      </w:r>
-      <w:r>
-        <w:t>andling</w:t>
-      </w:r>
-      <w:proofErr w:type="spellEnd"/>
-      <w:r>
-        <w:t xml:space="preserve"> OFF</w:t>
-      </w:r>
-      <w:r>
-        <w:t>.</w:t>
-      </w:r>
-    </w:p>
-    <w:p>
-      <w:pPr>
-        <w:rPr>
-          <w:b/>
-          <w:bCs/>
-        </w:rPr>
-      </w:pPr>
-      <w:r>
-        <w:rPr>
-          <w:b/>
-          <w:bCs/>
-        </w:rPr>
-        <w:t>Phase 4: Shutdown</w:t>
-      </w:r>
-    </w:p>
-    <w:p>
-      <w:r>
-        <w:rPr>
-          <w:b/>
-          <w:bCs/>
-        </w:rPr>
-        <w:t>10. Stop the Script:</w:t>
-      </w:r>
-      <w:r>
-        <w:t xml:space="preserve"> Click your PC terminal and press </w:t>
-      </w:r>
-      <w:proofErr w:type="spellStart"/>
-      <w:r>
-        <w:t>Ctrl+C</w:t>
-      </w:r>
-      <w:proofErr w:type="spellEnd"/>
-      <w:r>
-        <w:t xml:space="preserve"> to stop the Python script. Your pristine_ai_data.csv is now safely saved to your hard drive and packed with 100Hz gold. </w:t>
-      </w:r>
-      <w:r>
-        <w:rPr>
-          <w:b/>
-          <w:bCs/>
-        </w:rPr>
-        <w:t>11. Reactivate the Brain:</w:t>
-      </w:r>
-      <w:r>
-        <w:t xml:space="preserve"> Go back to your Serial Monitor and type:</w:t>
-      </w:r>
-    </w:p>
-    <w:p>
-      <w:r>
-        <w:t>set BRAIN_ACTIVE on</w:t>
-      </w:r>
-    </w:p>
-    <w:p>
-      <w:r>
-        <w:t xml:space="preserve">He will immediately "wake up," drop out of </w:t>
-      </w:r>
-      <w:proofErr w:type="spellStart"/>
-      <w:r>
-        <w:t>Mode_BrainDead</w:t>
-      </w:r>
-      <w:proofErr w:type="spellEnd"/>
-      <w:r>
-        <w:t xml:space="preserve">, and transition back to </w:t>
-      </w:r>
-      <w:proofErr w:type="spellStart"/>
-      <w:r>
-        <w:t>Mode_NormalDriving</w:t>
-      </w:r>
-      <w:proofErr w:type="spellEnd"/>
-      <w:r>
-        <w:t>.</w:t>
-      </w:r>
-    </w:p>
-    <w:p>
-      <w:r>
-        <w:t xml:space="preserve">If you spend just 10-15 minutes running through variations of Phase 3, you will easily generate 60,000 to 90,000 rows of perfect </w:t>
-      </w:r>
-      <w:r>
-        <w:t xml:space="preserve">AI </w:t>
-      </w:r>
-      <w:r>
-        <w:t>data chew through!</w:t>
-      </w:r>
+        <w:jc w:val="both"/>
+      </w:pPr>
     </w:p>
     <w:sectPr>
       <w:pgSz w:w="12240" w:h="15840"/>
@@ -769,6 +2155,268 @@
 <file path=word/numbering.xml><?xml version="1.0" encoding="utf-8"?>
 <w:numbering xmlns:wpc="http://schemas.microsoft.com/office/word/2010/wordprocessingCanvas" xmlns:cx="http://schemas.microsoft.com/office/drawing/2014/chartex" xmlns:cx1="http://schemas.microsoft.com/office/drawing/2015/9/8/chartex" xmlns:cx2="http://schemas.microsoft.com/office/drawing/2015/10/21/chartex" xmlns:cx3="http://schemas.microsoft.com/office/drawing/2016/5/9/chartex" xmlns:cx4="http://schemas.microsoft.com/office/drawing/2016/5/10/chartex" xmlns:cx5="http://schemas.microsoft.com/office/drawing/2016/5/11/chartex" xmlns:cx6="http://schemas.microsoft.com/office/drawing/2016/5/12/chartex" xmlns:cx7="http://schemas.microsoft.com/office/drawing/2016/5/13/chartex" xmlns:cx8="http://schemas.microsoft.com/office/drawing/2016/5/14/chartex" xmlns:mc="http://schemas.openxmlformats.org/markup-compatibility/2006" xmlns:aink="http://schemas.microsoft.com/office/drawing/2016/ink" xmlns:am3d="http://schemas.microsoft.com/office/drawing/2017/model3d" xmlns:o="urn:schemas-microsoft-com:office:office" xmlns:oel="http://schemas.microsoft.com/office/2019/extlst" xmlns:r="http://schemas.openxmlformats.org/officeDocument/2006/relationships" xmlns:m="http://schemas.openxmlformats.org/officeDocument/2006/math" xmlns:v="urn:schemas-microsoft-com:vml" xmlns:wp14="http://schemas.microsoft.com/office/word/2010/wordprocessingDrawing" xmlns:wp="http://schemas.openxmlformats.org/drawingml/2006/wordprocessingDrawing" xmlns:w10="urn:schemas-microsoft-com:office:word" xmlns:w="http://schemas.openxmlformats.org/wordprocessingml/2006/main" xmlns:w14="http://schemas.microsoft.com/office/word/2010/wordml" xmlns:w15="http://schemas.microsoft.com/office/word/2012/wordml" xmlns:w16cex="http://schemas.microsoft.com/office/word/2018/wordml/cex" xmlns:w16cid="http://schemas.microsoft.com/office/word/2016/wordml/cid" xmlns:w16="http://schemas.microsoft.com/office/word/2018/wordml" xmlns:w16du="http://schemas.microsoft.com/office/word/2023/wordml/word16du" xmlns:w16sdtdh="http://schemas.microsoft.com/office/word/2020/wordml/sdtdatahash" xmlns:w16sdtfl="http://schemas.microsoft.com/office/word/2024/wordml/sdtformatlock" xmlns:w16se="http://schemas.microsoft.com/office/word/2015/wordml/symex" xmlns:wpg="http://schemas.microsoft.com/office/word/2010/wordprocessingGroup" xmlns:wpi="http://schemas.microsoft.com/office/word/2010/wordprocessingInk" xmlns:wne="http://schemas.microsoft.com/office/word/2006/wordml" xmlns:wps="http://schemas.microsoft.com/office/word/2010/wordprocessingShape" mc:Ignorable="w14 w15 w16se w16cid w16 w16cex w16sdtdh w16sdtfl w16du wp14">
   <w:abstractNum w:abstractNumId="0" w15:restartNumberingAfterBreak="0">
+    <w:nsid w:val="0A157AC2"/>
+    <w:multiLevelType w:val="multilevel"/>
+    <w:tmpl w:val="735603C8"/>
+    <w:lvl w:ilvl="0">
+      <w:start w:val="1"/>
+      <w:numFmt w:val="decimal"/>
+      <w:lvlText w:val="%1."/>
+      <w:lvlJc w:val="left"/>
+      <w:pPr>
+        <w:tabs>
+          <w:tab w:val="num" w:pos="720"/>
+        </w:tabs>
+        <w:ind w:left="720" w:hanging="360"/>
+      </w:pPr>
+    </w:lvl>
+    <w:lvl w:ilvl="1" w:tentative="1">
+      <w:start w:val="1"/>
+      <w:numFmt w:val="decimal"/>
+      <w:lvlText w:val="%2."/>
+      <w:lvlJc w:val="left"/>
+      <w:pPr>
+        <w:tabs>
+          <w:tab w:val="num" w:pos="1440"/>
+        </w:tabs>
+        <w:ind w:left="1440" w:hanging="360"/>
+      </w:pPr>
+    </w:lvl>
+    <w:lvl w:ilvl="2" w:tentative="1">
+      <w:start w:val="1"/>
+      <w:numFmt w:val="decimal"/>
+      <w:lvlText w:val="%3."/>
+      <w:lvlJc w:val="left"/>
+      <w:pPr>
+        <w:tabs>
+          <w:tab w:val="num" w:pos="2160"/>
+        </w:tabs>
+        <w:ind w:left="2160" w:hanging="360"/>
+      </w:pPr>
+    </w:lvl>
+    <w:lvl w:ilvl="3" w:tentative="1">
+      <w:start w:val="1"/>
+      <w:numFmt w:val="decimal"/>
+      <w:lvlText w:val="%4."/>
+      <w:lvlJc w:val="left"/>
+      <w:pPr>
+        <w:tabs>
+          <w:tab w:val="num" w:pos="2880"/>
+        </w:tabs>
+        <w:ind w:left="2880" w:hanging="360"/>
+      </w:pPr>
+    </w:lvl>
+    <w:lvl w:ilvl="4" w:tentative="1">
+      <w:start w:val="1"/>
+      <w:numFmt w:val="decimal"/>
+      <w:lvlText w:val="%5."/>
+      <w:lvlJc w:val="left"/>
+      <w:pPr>
+        <w:tabs>
+          <w:tab w:val="num" w:pos="3600"/>
+        </w:tabs>
+        <w:ind w:left="3600" w:hanging="360"/>
+      </w:pPr>
+    </w:lvl>
+    <w:lvl w:ilvl="5" w:tentative="1">
+      <w:start w:val="1"/>
+      <w:numFmt w:val="decimal"/>
+      <w:lvlText w:val="%6."/>
+      <w:lvlJc w:val="left"/>
+      <w:pPr>
+        <w:tabs>
+          <w:tab w:val="num" w:pos="4320"/>
+        </w:tabs>
+        <w:ind w:left="4320" w:hanging="360"/>
+      </w:pPr>
+    </w:lvl>
+    <w:lvl w:ilvl="6" w:tentative="1">
+      <w:start w:val="1"/>
+      <w:numFmt w:val="decimal"/>
+      <w:lvlText w:val="%7."/>
+      <w:lvlJc w:val="left"/>
+      <w:pPr>
+        <w:tabs>
+          <w:tab w:val="num" w:pos="5040"/>
+        </w:tabs>
+        <w:ind w:left="5040" w:hanging="360"/>
+      </w:pPr>
+    </w:lvl>
+    <w:lvl w:ilvl="7" w:tentative="1">
+      <w:start w:val="1"/>
+      <w:numFmt w:val="decimal"/>
+      <w:lvlText w:val="%8."/>
+      <w:lvlJc w:val="left"/>
+      <w:pPr>
+        <w:tabs>
+          <w:tab w:val="num" w:pos="5760"/>
+        </w:tabs>
+        <w:ind w:left="5760" w:hanging="360"/>
+      </w:pPr>
+    </w:lvl>
+    <w:lvl w:ilvl="8" w:tentative="1">
+      <w:start w:val="1"/>
+      <w:numFmt w:val="decimal"/>
+      <w:lvlText w:val="%9."/>
+      <w:lvlJc w:val="left"/>
+      <w:pPr>
+        <w:tabs>
+          <w:tab w:val="num" w:pos="6480"/>
+        </w:tabs>
+        <w:ind w:left="6480" w:hanging="360"/>
+      </w:pPr>
+    </w:lvl>
+  </w:abstractNum>
+  <w:abstractNum w:abstractNumId="1" w15:restartNumberingAfterBreak="0">
+    <w:nsid w:val="13D16C3D"/>
+    <w:multiLevelType w:val="multilevel"/>
+    <w:tmpl w:val="71DC78B6"/>
+    <w:lvl w:ilvl="0">
+      <w:start w:val="1"/>
+      <w:numFmt w:val="bullet"/>
+      <w:lvlText w:val=""/>
+      <w:lvlJc w:val="left"/>
+      <w:pPr>
+        <w:tabs>
+          <w:tab w:val="num" w:pos="720"/>
+        </w:tabs>
+        <w:ind w:left="720" w:hanging="360"/>
+      </w:pPr>
+      <w:rPr>
+        <w:rFonts w:ascii="Symbol" w:hAnsi="Symbol" w:hint="default"/>
+        <w:sz w:val="20"/>
+      </w:rPr>
+    </w:lvl>
+    <w:lvl w:ilvl="1" w:tentative="1">
+      <w:start w:val="1"/>
+      <w:numFmt w:val="bullet"/>
+      <w:lvlText w:val="o"/>
+      <w:lvlJc w:val="left"/>
+      <w:pPr>
+        <w:tabs>
+          <w:tab w:val="num" w:pos="1440"/>
+        </w:tabs>
+        <w:ind w:left="1440" w:hanging="360"/>
+      </w:pPr>
+      <w:rPr>
+        <w:rFonts w:ascii="Courier New" w:hAnsi="Courier New" w:hint="default"/>
+        <w:sz w:val="20"/>
+      </w:rPr>
+    </w:lvl>
+    <w:lvl w:ilvl="2" w:tentative="1">
+      <w:start w:val="1"/>
+      <w:numFmt w:val="bullet"/>
+      <w:lvlText w:val=""/>
+      <w:lvlJc w:val="left"/>
+      <w:pPr>
+        <w:tabs>
+          <w:tab w:val="num" w:pos="2160"/>
+        </w:tabs>
+        <w:ind w:left="2160" w:hanging="360"/>
+      </w:pPr>
+      <w:rPr>
+        <w:rFonts w:ascii="Wingdings" w:hAnsi="Wingdings" w:hint="default"/>
+        <w:sz w:val="20"/>
+      </w:rPr>
+    </w:lvl>
+    <w:lvl w:ilvl="3" w:tentative="1">
+      <w:start w:val="1"/>
+      <w:numFmt w:val="bullet"/>
+      <w:lvlText w:val=""/>
+      <w:lvlJc w:val="left"/>
+      <w:pPr>
+        <w:tabs>
+          <w:tab w:val="num" w:pos="2880"/>
+        </w:tabs>
+        <w:ind w:left="2880" w:hanging="360"/>
+      </w:pPr>
+      <w:rPr>
+        <w:rFonts w:ascii="Wingdings" w:hAnsi="Wingdings" w:hint="default"/>
+        <w:sz w:val="20"/>
+      </w:rPr>
+    </w:lvl>
+    <w:lvl w:ilvl="4" w:tentative="1">
+      <w:start w:val="1"/>
+      <w:numFmt w:val="bullet"/>
+      <w:lvlText w:val=""/>
+      <w:lvlJc w:val="left"/>
+      <w:pPr>
+        <w:tabs>
+          <w:tab w:val="num" w:pos="3600"/>
+        </w:tabs>
+        <w:ind w:left="3600" w:hanging="360"/>
+      </w:pPr>
+      <w:rPr>
+        <w:rFonts w:ascii="Wingdings" w:hAnsi="Wingdings" w:hint="default"/>
+        <w:sz w:val="20"/>
+      </w:rPr>
+    </w:lvl>
+    <w:lvl w:ilvl="5" w:tentative="1">
+      <w:start w:val="1"/>
+      <w:numFmt w:val="bullet"/>
+      <w:lvlText w:val=""/>
+      <w:lvlJc w:val="left"/>
+      <w:pPr>
+        <w:tabs>
+          <w:tab w:val="num" w:pos="4320"/>
+        </w:tabs>
+        <w:ind w:left="4320" w:hanging="360"/>
+      </w:pPr>
+      <w:rPr>
+        <w:rFonts w:ascii="Wingdings" w:hAnsi="Wingdings" w:hint="default"/>
+        <w:sz w:val="20"/>
+      </w:rPr>
+    </w:lvl>
+    <w:lvl w:ilvl="6" w:tentative="1">
+      <w:start w:val="1"/>
+      <w:numFmt w:val="bullet"/>
+      <w:lvlText w:val=""/>
+      <w:lvlJc w:val="left"/>
+      <w:pPr>
+        <w:tabs>
+          <w:tab w:val="num" w:pos="5040"/>
+        </w:tabs>
+        <w:ind w:left="5040" w:hanging="360"/>
+      </w:pPr>
+      <w:rPr>
+        <w:rFonts w:ascii="Wingdings" w:hAnsi="Wingdings" w:hint="default"/>
+        <w:sz w:val="20"/>
+      </w:rPr>
+    </w:lvl>
+    <w:lvl w:ilvl="7" w:tentative="1">
+      <w:start w:val="1"/>
+      <w:numFmt w:val="bullet"/>
+      <w:lvlText w:val=""/>
+      <w:lvlJc w:val="left"/>
+      <w:pPr>
+        <w:tabs>
+          <w:tab w:val="num" w:pos="5760"/>
+        </w:tabs>
+        <w:ind w:left="5760" w:hanging="360"/>
+      </w:pPr>
+      <w:rPr>
+        <w:rFonts w:ascii="Wingdings" w:hAnsi="Wingdings" w:hint="default"/>
+        <w:sz w:val="20"/>
+      </w:rPr>
+    </w:lvl>
+    <w:lvl w:ilvl="8" w:tentative="1">
+      <w:start w:val="1"/>
+      <w:numFmt w:val="bullet"/>
+      <w:lvlText w:val=""/>
+      <w:lvlJc w:val="left"/>
+      <w:pPr>
+        <w:tabs>
+          <w:tab w:val="num" w:pos="6480"/>
+        </w:tabs>
+        <w:ind w:left="6480" w:hanging="360"/>
+      </w:pPr>
+      <w:rPr>
+        <w:rFonts w:ascii="Wingdings" w:hAnsi="Wingdings" w:hint="default"/>
+        <w:sz w:val="20"/>
+      </w:rPr>
+    </w:lvl>
+  </w:abstractNum>
+  <w:abstractNum w:abstractNumId="2" w15:restartNumberingAfterBreak="0">
     <w:nsid w:val="20ED5207"/>
     <w:multiLevelType w:val="multilevel"/>
     <w:tmpl w:val="173E0F20"/>
@@ -917,7 +2565,269 @@
       </w:rPr>
     </w:lvl>
   </w:abstractNum>
-  <w:abstractNum w:abstractNumId="1" w15:restartNumberingAfterBreak="0">
+  <w:abstractNum w:abstractNumId="3" w15:restartNumberingAfterBreak="0">
+    <w:nsid w:val="614564A4"/>
+    <w:multiLevelType w:val="multilevel"/>
+    <w:tmpl w:val="7EEA665A"/>
+    <w:lvl w:ilvl="0">
+      <w:start w:val="1"/>
+      <w:numFmt w:val="bullet"/>
+      <w:lvlText w:val=""/>
+      <w:lvlJc w:val="left"/>
+      <w:pPr>
+        <w:tabs>
+          <w:tab w:val="num" w:pos="720"/>
+        </w:tabs>
+        <w:ind w:left="720" w:hanging="360"/>
+      </w:pPr>
+      <w:rPr>
+        <w:rFonts w:ascii="Symbol" w:hAnsi="Symbol" w:hint="default"/>
+        <w:sz w:val="20"/>
+      </w:rPr>
+    </w:lvl>
+    <w:lvl w:ilvl="1" w:tentative="1">
+      <w:start w:val="1"/>
+      <w:numFmt w:val="bullet"/>
+      <w:lvlText w:val="o"/>
+      <w:lvlJc w:val="left"/>
+      <w:pPr>
+        <w:tabs>
+          <w:tab w:val="num" w:pos="1440"/>
+        </w:tabs>
+        <w:ind w:left="1440" w:hanging="360"/>
+      </w:pPr>
+      <w:rPr>
+        <w:rFonts w:ascii="Courier New" w:hAnsi="Courier New" w:hint="default"/>
+        <w:sz w:val="20"/>
+      </w:rPr>
+    </w:lvl>
+    <w:lvl w:ilvl="2" w:tentative="1">
+      <w:start w:val="1"/>
+      <w:numFmt w:val="bullet"/>
+      <w:lvlText w:val=""/>
+      <w:lvlJc w:val="left"/>
+      <w:pPr>
+        <w:tabs>
+          <w:tab w:val="num" w:pos="2160"/>
+        </w:tabs>
+        <w:ind w:left="2160" w:hanging="360"/>
+      </w:pPr>
+      <w:rPr>
+        <w:rFonts w:ascii="Wingdings" w:hAnsi="Wingdings" w:hint="default"/>
+        <w:sz w:val="20"/>
+      </w:rPr>
+    </w:lvl>
+    <w:lvl w:ilvl="3" w:tentative="1">
+      <w:start w:val="1"/>
+      <w:numFmt w:val="bullet"/>
+      <w:lvlText w:val=""/>
+      <w:lvlJc w:val="left"/>
+      <w:pPr>
+        <w:tabs>
+          <w:tab w:val="num" w:pos="2880"/>
+        </w:tabs>
+        <w:ind w:left="2880" w:hanging="360"/>
+      </w:pPr>
+      <w:rPr>
+        <w:rFonts w:ascii="Wingdings" w:hAnsi="Wingdings" w:hint="default"/>
+        <w:sz w:val="20"/>
+      </w:rPr>
+    </w:lvl>
+    <w:lvl w:ilvl="4" w:tentative="1">
+      <w:start w:val="1"/>
+      <w:numFmt w:val="bullet"/>
+      <w:lvlText w:val=""/>
+      <w:lvlJc w:val="left"/>
+      <w:pPr>
+        <w:tabs>
+          <w:tab w:val="num" w:pos="3600"/>
+        </w:tabs>
+        <w:ind w:left="3600" w:hanging="360"/>
+      </w:pPr>
+      <w:rPr>
+        <w:rFonts w:ascii="Wingdings" w:hAnsi="Wingdings" w:hint="default"/>
+        <w:sz w:val="20"/>
+      </w:rPr>
+    </w:lvl>
+    <w:lvl w:ilvl="5" w:tentative="1">
+      <w:start w:val="1"/>
+      <w:numFmt w:val="bullet"/>
+      <w:lvlText w:val=""/>
+      <w:lvlJc w:val="left"/>
+      <w:pPr>
+        <w:tabs>
+          <w:tab w:val="num" w:pos="4320"/>
+        </w:tabs>
+        <w:ind w:left="4320" w:hanging="360"/>
+      </w:pPr>
+      <w:rPr>
+        <w:rFonts w:ascii="Wingdings" w:hAnsi="Wingdings" w:hint="default"/>
+        <w:sz w:val="20"/>
+      </w:rPr>
+    </w:lvl>
+    <w:lvl w:ilvl="6" w:tentative="1">
+      <w:start w:val="1"/>
+      <w:numFmt w:val="bullet"/>
+      <w:lvlText w:val=""/>
+      <w:lvlJc w:val="left"/>
+      <w:pPr>
+        <w:tabs>
+          <w:tab w:val="num" w:pos="5040"/>
+        </w:tabs>
+        <w:ind w:left="5040" w:hanging="360"/>
+      </w:pPr>
+      <w:rPr>
+        <w:rFonts w:ascii="Wingdings" w:hAnsi="Wingdings" w:hint="default"/>
+        <w:sz w:val="20"/>
+      </w:rPr>
+    </w:lvl>
+    <w:lvl w:ilvl="7" w:tentative="1">
+      <w:start w:val="1"/>
+      <w:numFmt w:val="bullet"/>
+      <w:lvlText w:val=""/>
+      <w:lvlJc w:val="left"/>
+      <w:pPr>
+        <w:tabs>
+          <w:tab w:val="num" w:pos="5760"/>
+        </w:tabs>
+        <w:ind w:left="5760" w:hanging="360"/>
+      </w:pPr>
+      <w:rPr>
+        <w:rFonts w:ascii="Wingdings" w:hAnsi="Wingdings" w:hint="default"/>
+        <w:sz w:val="20"/>
+      </w:rPr>
+    </w:lvl>
+    <w:lvl w:ilvl="8" w:tentative="1">
+      <w:start w:val="1"/>
+      <w:numFmt w:val="bullet"/>
+      <w:lvlText w:val=""/>
+      <w:lvlJc w:val="left"/>
+      <w:pPr>
+        <w:tabs>
+          <w:tab w:val="num" w:pos="6480"/>
+        </w:tabs>
+        <w:ind w:left="6480" w:hanging="360"/>
+      </w:pPr>
+      <w:rPr>
+        <w:rFonts w:ascii="Wingdings" w:hAnsi="Wingdings" w:hint="default"/>
+        <w:sz w:val="20"/>
+      </w:rPr>
+    </w:lvl>
+  </w:abstractNum>
+  <w:abstractNum w:abstractNumId="4" w15:restartNumberingAfterBreak="0">
+    <w:nsid w:val="65E96171"/>
+    <w:multiLevelType w:val="multilevel"/>
+    <w:tmpl w:val="DE0E384C"/>
+    <w:lvl w:ilvl="0">
+      <w:start w:val="3"/>
+      <w:numFmt w:val="decimal"/>
+      <w:lvlText w:val="%1."/>
+      <w:lvlJc w:val="left"/>
+      <w:pPr>
+        <w:tabs>
+          <w:tab w:val="num" w:pos="720"/>
+        </w:tabs>
+        <w:ind w:left="720" w:hanging="360"/>
+      </w:pPr>
+    </w:lvl>
+    <w:lvl w:ilvl="1" w:tentative="1">
+      <w:start w:val="1"/>
+      <w:numFmt w:val="decimal"/>
+      <w:lvlText w:val="%2."/>
+      <w:lvlJc w:val="left"/>
+      <w:pPr>
+        <w:tabs>
+          <w:tab w:val="num" w:pos="1440"/>
+        </w:tabs>
+        <w:ind w:left="1440" w:hanging="360"/>
+      </w:pPr>
+    </w:lvl>
+    <w:lvl w:ilvl="2" w:tentative="1">
+      <w:start w:val="1"/>
+      <w:numFmt w:val="decimal"/>
+      <w:lvlText w:val="%3."/>
+      <w:lvlJc w:val="left"/>
+      <w:pPr>
+        <w:tabs>
+          <w:tab w:val="num" w:pos="2160"/>
+        </w:tabs>
+        <w:ind w:left="2160" w:hanging="360"/>
+      </w:pPr>
+    </w:lvl>
+    <w:lvl w:ilvl="3" w:tentative="1">
+      <w:start w:val="1"/>
+      <w:numFmt w:val="decimal"/>
+      <w:lvlText w:val="%4."/>
+      <w:lvlJc w:val="left"/>
+      <w:pPr>
+        <w:tabs>
+          <w:tab w:val="num" w:pos="2880"/>
+        </w:tabs>
+        <w:ind w:left="2880" w:hanging="360"/>
+      </w:pPr>
+    </w:lvl>
+    <w:lvl w:ilvl="4" w:tentative="1">
+      <w:start w:val="1"/>
+      <w:numFmt w:val="decimal"/>
+      <w:lvlText w:val="%5."/>
+      <w:lvlJc w:val="left"/>
+      <w:pPr>
+        <w:tabs>
+          <w:tab w:val="num" w:pos="3600"/>
+        </w:tabs>
+        <w:ind w:left="3600" w:hanging="360"/>
+      </w:pPr>
+    </w:lvl>
+    <w:lvl w:ilvl="5" w:tentative="1">
+      <w:start w:val="1"/>
+      <w:numFmt w:val="decimal"/>
+      <w:lvlText w:val="%6."/>
+      <w:lvlJc w:val="left"/>
+      <w:pPr>
+        <w:tabs>
+          <w:tab w:val="num" w:pos="4320"/>
+        </w:tabs>
+        <w:ind w:left="4320" w:hanging="360"/>
+      </w:pPr>
+    </w:lvl>
+    <w:lvl w:ilvl="6" w:tentative="1">
+      <w:start w:val="1"/>
+      <w:numFmt w:val="decimal"/>
+      <w:lvlText w:val="%7."/>
+      <w:lvlJc w:val="left"/>
+      <w:pPr>
+        <w:tabs>
+          <w:tab w:val="num" w:pos="5040"/>
+        </w:tabs>
+        <w:ind w:left="5040" w:hanging="360"/>
+      </w:pPr>
+    </w:lvl>
+    <w:lvl w:ilvl="7" w:tentative="1">
+      <w:start w:val="1"/>
+      <w:numFmt w:val="decimal"/>
+      <w:lvlText w:val="%8."/>
+      <w:lvlJc w:val="left"/>
+      <w:pPr>
+        <w:tabs>
+          <w:tab w:val="num" w:pos="5760"/>
+        </w:tabs>
+        <w:ind w:left="5760" w:hanging="360"/>
+      </w:pPr>
+    </w:lvl>
+    <w:lvl w:ilvl="8" w:tentative="1">
+      <w:start w:val="1"/>
+      <w:numFmt w:val="decimal"/>
+      <w:lvlText w:val="%9."/>
+      <w:lvlJc w:val="left"/>
+      <w:pPr>
+        <w:tabs>
+          <w:tab w:val="num" w:pos="6480"/>
+        </w:tabs>
+        <w:ind w:left="6480" w:hanging="360"/>
+      </w:pPr>
+    </w:lvl>
+  </w:abstractNum>
+  <w:abstractNum w:abstractNumId="5" w15:restartNumberingAfterBreak="0">
     <w:nsid w:val="67B603C4"/>
     <w:multiLevelType w:val="multilevel"/>
     <w:tmpl w:val="433E13DA"/>
@@ -1066,7 +2976,7 @@
       </w:rPr>
     </w:lvl>
   </w:abstractNum>
-  <w:abstractNum w:abstractNumId="2" w15:restartNumberingAfterBreak="0">
+  <w:abstractNum w:abstractNumId="6" w15:restartNumberingAfterBreak="0">
     <w:nsid w:val="6E6F756E"/>
     <w:multiLevelType w:val="multilevel"/>
     <w:tmpl w:val="8250DAF4"/>
@@ -1215,7 +3125,7 @@
       </w:rPr>
     </w:lvl>
   </w:abstractNum>
-  <w:abstractNum w:abstractNumId="3" w15:restartNumberingAfterBreak="0">
+  <w:abstractNum w:abstractNumId="7" w15:restartNumberingAfterBreak="0">
     <w:nsid w:val="78227CA0"/>
     <w:multiLevelType w:val="multilevel"/>
     <w:tmpl w:val="ABA8F374"/>
@@ -1364,17 +3274,333 @@
       </w:rPr>
     </w:lvl>
   </w:abstractNum>
+  <w:abstractNum w:abstractNumId="8" w15:restartNumberingAfterBreak="0">
+    <w:nsid w:val="7C0064C3"/>
+    <w:multiLevelType w:val="multilevel"/>
+    <w:tmpl w:val="D3782F22"/>
+    <w:lvl w:ilvl="0">
+      <w:start w:val="1"/>
+      <w:numFmt w:val="bullet"/>
+      <w:lvlText w:val=""/>
+      <w:lvlJc w:val="left"/>
+      <w:pPr>
+        <w:tabs>
+          <w:tab w:val="num" w:pos="720"/>
+        </w:tabs>
+        <w:ind w:left="720" w:hanging="360"/>
+      </w:pPr>
+      <w:rPr>
+        <w:rFonts w:ascii="Symbol" w:hAnsi="Symbol" w:hint="default"/>
+        <w:sz w:val="20"/>
+      </w:rPr>
+    </w:lvl>
+    <w:lvl w:ilvl="1" w:tentative="1">
+      <w:start w:val="1"/>
+      <w:numFmt w:val="bullet"/>
+      <w:lvlText w:val="o"/>
+      <w:lvlJc w:val="left"/>
+      <w:pPr>
+        <w:tabs>
+          <w:tab w:val="num" w:pos="1440"/>
+        </w:tabs>
+        <w:ind w:left="1440" w:hanging="360"/>
+      </w:pPr>
+      <w:rPr>
+        <w:rFonts w:ascii="Courier New" w:hAnsi="Courier New" w:hint="default"/>
+        <w:sz w:val="20"/>
+      </w:rPr>
+    </w:lvl>
+    <w:lvl w:ilvl="2" w:tentative="1">
+      <w:start w:val="1"/>
+      <w:numFmt w:val="bullet"/>
+      <w:lvlText w:val=""/>
+      <w:lvlJc w:val="left"/>
+      <w:pPr>
+        <w:tabs>
+          <w:tab w:val="num" w:pos="2160"/>
+        </w:tabs>
+        <w:ind w:left="2160" w:hanging="360"/>
+      </w:pPr>
+      <w:rPr>
+        <w:rFonts w:ascii="Wingdings" w:hAnsi="Wingdings" w:hint="default"/>
+        <w:sz w:val="20"/>
+      </w:rPr>
+    </w:lvl>
+    <w:lvl w:ilvl="3" w:tentative="1">
+      <w:start w:val="1"/>
+      <w:numFmt w:val="bullet"/>
+      <w:lvlText w:val=""/>
+      <w:lvlJc w:val="left"/>
+      <w:pPr>
+        <w:tabs>
+          <w:tab w:val="num" w:pos="2880"/>
+        </w:tabs>
+        <w:ind w:left="2880" w:hanging="360"/>
+      </w:pPr>
+      <w:rPr>
+        <w:rFonts w:ascii="Wingdings" w:hAnsi="Wingdings" w:hint="default"/>
+        <w:sz w:val="20"/>
+      </w:rPr>
+    </w:lvl>
+    <w:lvl w:ilvl="4" w:tentative="1">
+      <w:start w:val="1"/>
+      <w:numFmt w:val="bullet"/>
+      <w:lvlText w:val=""/>
+      <w:lvlJc w:val="left"/>
+      <w:pPr>
+        <w:tabs>
+          <w:tab w:val="num" w:pos="3600"/>
+        </w:tabs>
+        <w:ind w:left="3600" w:hanging="360"/>
+      </w:pPr>
+      <w:rPr>
+        <w:rFonts w:ascii="Wingdings" w:hAnsi="Wingdings" w:hint="default"/>
+        <w:sz w:val="20"/>
+      </w:rPr>
+    </w:lvl>
+    <w:lvl w:ilvl="5" w:tentative="1">
+      <w:start w:val="1"/>
+      <w:numFmt w:val="bullet"/>
+      <w:lvlText w:val=""/>
+      <w:lvlJc w:val="left"/>
+      <w:pPr>
+        <w:tabs>
+          <w:tab w:val="num" w:pos="4320"/>
+        </w:tabs>
+        <w:ind w:left="4320" w:hanging="360"/>
+      </w:pPr>
+      <w:rPr>
+        <w:rFonts w:ascii="Wingdings" w:hAnsi="Wingdings" w:hint="default"/>
+        <w:sz w:val="20"/>
+      </w:rPr>
+    </w:lvl>
+    <w:lvl w:ilvl="6" w:tentative="1">
+      <w:start w:val="1"/>
+      <w:numFmt w:val="bullet"/>
+      <w:lvlText w:val=""/>
+      <w:lvlJc w:val="left"/>
+      <w:pPr>
+        <w:tabs>
+          <w:tab w:val="num" w:pos="5040"/>
+        </w:tabs>
+        <w:ind w:left="5040" w:hanging="360"/>
+      </w:pPr>
+      <w:rPr>
+        <w:rFonts w:ascii="Wingdings" w:hAnsi="Wingdings" w:hint="default"/>
+        <w:sz w:val="20"/>
+      </w:rPr>
+    </w:lvl>
+    <w:lvl w:ilvl="7" w:tentative="1">
+      <w:start w:val="1"/>
+      <w:numFmt w:val="bullet"/>
+      <w:lvlText w:val=""/>
+      <w:lvlJc w:val="left"/>
+      <w:pPr>
+        <w:tabs>
+          <w:tab w:val="num" w:pos="5760"/>
+        </w:tabs>
+        <w:ind w:left="5760" w:hanging="360"/>
+      </w:pPr>
+      <w:rPr>
+        <w:rFonts w:ascii="Wingdings" w:hAnsi="Wingdings" w:hint="default"/>
+        <w:sz w:val="20"/>
+      </w:rPr>
+    </w:lvl>
+    <w:lvl w:ilvl="8" w:tentative="1">
+      <w:start w:val="1"/>
+      <w:numFmt w:val="bullet"/>
+      <w:lvlText w:val=""/>
+      <w:lvlJc w:val="left"/>
+      <w:pPr>
+        <w:tabs>
+          <w:tab w:val="num" w:pos="6480"/>
+        </w:tabs>
+        <w:ind w:left="6480" w:hanging="360"/>
+      </w:pPr>
+      <w:rPr>
+        <w:rFonts w:ascii="Wingdings" w:hAnsi="Wingdings" w:hint="default"/>
+        <w:sz w:val="20"/>
+      </w:rPr>
+    </w:lvl>
+  </w:abstractNum>
+  <w:abstractNum w:abstractNumId="9" w15:restartNumberingAfterBreak="0">
+    <w:nsid w:val="7E6E0AC9"/>
+    <w:multiLevelType w:val="multilevel"/>
+    <w:tmpl w:val="094AD13C"/>
+    <w:lvl w:ilvl="0">
+      <w:start w:val="1"/>
+      <w:numFmt w:val="bullet"/>
+      <w:lvlText w:val=""/>
+      <w:lvlJc w:val="left"/>
+      <w:pPr>
+        <w:tabs>
+          <w:tab w:val="num" w:pos="720"/>
+        </w:tabs>
+        <w:ind w:left="720" w:hanging="360"/>
+      </w:pPr>
+      <w:rPr>
+        <w:rFonts w:ascii="Symbol" w:hAnsi="Symbol" w:hint="default"/>
+        <w:sz w:val="20"/>
+      </w:rPr>
+    </w:lvl>
+    <w:lvl w:ilvl="1" w:tentative="1">
+      <w:start w:val="1"/>
+      <w:numFmt w:val="bullet"/>
+      <w:lvlText w:val="o"/>
+      <w:lvlJc w:val="left"/>
+      <w:pPr>
+        <w:tabs>
+          <w:tab w:val="num" w:pos="1440"/>
+        </w:tabs>
+        <w:ind w:left="1440" w:hanging="360"/>
+      </w:pPr>
+      <w:rPr>
+        <w:rFonts w:ascii="Courier New" w:hAnsi="Courier New" w:hint="default"/>
+        <w:sz w:val="20"/>
+      </w:rPr>
+    </w:lvl>
+    <w:lvl w:ilvl="2" w:tentative="1">
+      <w:start w:val="1"/>
+      <w:numFmt w:val="bullet"/>
+      <w:lvlText w:val=""/>
+      <w:lvlJc w:val="left"/>
+      <w:pPr>
+        <w:tabs>
+          <w:tab w:val="num" w:pos="2160"/>
+        </w:tabs>
+        <w:ind w:left="2160" w:hanging="360"/>
+      </w:pPr>
+      <w:rPr>
+        <w:rFonts w:ascii="Wingdings" w:hAnsi="Wingdings" w:hint="default"/>
+        <w:sz w:val="20"/>
+      </w:rPr>
+    </w:lvl>
+    <w:lvl w:ilvl="3" w:tentative="1">
+      <w:start w:val="1"/>
+      <w:numFmt w:val="bullet"/>
+      <w:lvlText w:val=""/>
+      <w:lvlJc w:val="left"/>
+      <w:pPr>
+        <w:tabs>
+          <w:tab w:val="num" w:pos="2880"/>
+        </w:tabs>
+        <w:ind w:left="2880" w:hanging="360"/>
+      </w:pPr>
+      <w:rPr>
+        <w:rFonts w:ascii="Wingdings" w:hAnsi="Wingdings" w:hint="default"/>
+        <w:sz w:val="20"/>
+      </w:rPr>
+    </w:lvl>
+    <w:lvl w:ilvl="4" w:tentative="1">
+      <w:start w:val="1"/>
+      <w:numFmt w:val="bullet"/>
+      <w:lvlText w:val=""/>
+      <w:lvlJc w:val="left"/>
+      <w:pPr>
+        <w:tabs>
+          <w:tab w:val="num" w:pos="3600"/>
+        </w:tabs>
+        <w:ind w:left="3600" w:hanging="360"/>
+      </w:pPr>
+      <w:rPr>
+        <w:rFonts w:ascii="Wingdings" w:hAnsi="Wingdings" w:hint="default"/>
+        <w:sz w:val="20"/>
+      </w:rPr>
+    </w:lvl>
+    <w:lvl w:ilvl="5" w:tentative="1">
+      <w:start w:val="1"/>
+      <w:numFmt w:val="bullet"/>
+      <w:lvlText w:val=""/>
+      <w:lvlJc w:val="left"/>
+      <w:pPr>
+        <w:tabs>
+          <w:tab w:val="num" w:pos="4320"/>
+        </w:tabs>
+        <w:ind w:left="4320" w:hanging="360"/>
+      </w:pPr>
+      <w:rPr>
+        <w:rFonts w:ascii="Wingdings" w:hAnsi="Wingdings" w:hint="default"/>
+        <w:sz w:val="20"/>
+      </w:rPr>
+    </w:lvl>
+    <w:lvl w:ilvl="6" w:tentative="1">
+      <w:start w:val="1"/>
+      <w:numFmt w:val="bullet"/>
+      <w:lvlText w:val=""/>
+      <w:lvlJc w:val="left"/>
+      <w:pPr>
+        <w:tabs>
+          <w:tab w:val="num" w:pos="5040"/>
+        </w:tabs>
+        <w:ind w:left="5040" w:hanging="360"/>
+      </w:pPr>
+      <w:rPr>
+        <w:rFonts w:ascii="Wingdings" w:hAnsi="Wingdings" w:hint="default"/>
+        <w:sz w:val="20"/>
+      </w:rPr>
+    </w:lvl>
+    <w:lvl w:ilvl="7" w:tentative="1">
+      <w:start w:val="1"/>
+      <w:numFmt w:val="bullet"/>
+      <w:lvlText w:val=""/>
+      <w:lvlJc w:val="left"/>
+      <w:pPr>
+        <w:tabs>
+          <w:tab w:val="num" w:pos="5760"/>
+        </w:tabs>
+        <w:ind w:left="5760" w:hanging="360"/>
+      </w:pPr>
+      <w:rPr>
+        <w:rFonts w:ascii="Wingdings" w:hAnsi="Wingdings" w:hint="default"/>
+        <w:sz w:val="20"/>
+      </w:rPr>
+    </w:lvl>
+    <w:lvl w:ilvl="8" w:tentative="1">
+      <w:start w:val="1"/>
+      <w:numFmt w:val="bullet"/>
+      <w:lvlText w:val=""/>
+      <w:lvlJc w:val="left"/>
+      <w:pPr>
+        <w:tabs>
+          <w:tab w:val="num" w:pos="6480"/>
+        </w:tabs>
+        <w:ind w:left="6480" w:hanging="360"/>
+      </w:pPr>
+      <w:rPr>
+        <w:rFonts w:ascii="Wingdings" w:hAnsi="Wingdings" w:hint="default"/>
+        <w:sz w:val="20"/>
+      </w:rPr>
+    </w:lvl>
+  </w:abstractNum>
   <w:num w:numId="1" w16cid:durableId="1476294396">
+    <w:abstractNumId w:val="2"/>
+  </w:num>
+  <w:num w:numId="2" w16cid:durableId="152189207">
+    <w:abstractNumId w:val="5"/>
+  </w:num>
+  <w:num w:numId="3" w16cid:durableId="572815090">
+    <w:abstractNumId w:val="6"/>
+  </w:num>
+  <w:num w:numId="4" w16cid:durableId="608783586">
+    <w:abstractNumId w:val="7"/>
+  </w:num>
+  <w:num w:numId="5" w16cid:durableId="731199647">
     <w:abstractNumId w:val="0"/>
   </w:num>
-  <w:num w:numId="2" w16cid:durableId="152189207">
+  <w:num w:numId="6" w16cid:durableId="172963425">
+    <w:abstractNumId w:val="4"/>
+  </w:num>
+  <w:num w:numId="7" w16cid:durableId="1878662686">
+    <w:abstractNumId w:val="3"/>
+  </w:num>
+  <w:num w:numId="8" w16cid:durableId="651907590">
     <w:abstractNumId w:val="1"/>
   </w:num>
-  <w:num w:numId="3" w16cid:durableId="572815090">
-    <w:abstractNumId w:val="2"/>
+  <w:num w:numId="9" w16cid:durableId="936669304">
+    <w:abstractNumId w:val="9"/>
   </w:num>
-  <w:num w:numId="4" w16cid:durableId="608783586">
-    <w:abstractNumId w:val="3"/>
+  <w:num w:numId="10" w16cid:durableId="1165824831">
+    <w:abstractNumId w:val="8"/>
   </w:num>
 </w:numbering>
 </file>
@@ -1830,7 +4056,6 @@
     <w:next w:val="Normal"/>
     <w:link w:val="Heading3Char"/>
     <w:uiPriority w:val="9"/>
-    <w:semiHidden/>
     <w:unhideWhenUsed/>
     <w:qFormat/>
     <w:rsid w:val="008F17CD"/>
@@ -1853,7 +4078,6 @@
     <w:next w:val="Normal"/>
     <w:link w:val="Heading4Char"/>
     <w:uiPriority w:val="9"/>
-    <w:semiHidden/>
     <w:unhideWhenUsed/>
     <w:qFormat/>
     <w:rsid w:val="008F17CD"/>
@@ -1982,6 +4206,7 @@
   <w:style w:type="character" w:default="1" w:styleId="DefaultParagraphFont">
     <w:name w:val="Default Paragraph Font"/>
     <w:uiPriority w:val="1"/>
+    <w:semiHidden/>
     <w:unhideWhenUsed/>
   </w:style>
   <w:style w:type="table" w:default="1" w:styleId="TableNormal">
@@ -2037,7 +4262,6 @@
     <w:basedOn w:val="DefaultParagraphFont"/>
     <w:link w:val="Heading3"/>
     <w:uiPriority w:val="9"/>
-    <w:semiHidden/>
     <w:rsid w:val="008F17CD"/>
     <w:rPr>
       <w:rFonts w:eastAsiaTheme="majorEastAsia" w:cstheme="majorBidi"/>
@@ -2051,7 +4275,6 @@
     <w:basedOn w:val="DefaultParagraphFont"/>
     <w:link w:val="Heading4"/>
     <w:uiPriority w:val="9"/>
-    <w:semiHidden/>
     <w:rsid w:val="008F17CD"/>
     <w:rPr>
       <w:rFonts w:eastAsiaTheme="majorEastAsia" w:cstheme="majorBidi"/>
@@ -2299,11 +4522,23 @@
     <w:name w:val="Normal (Web)"/>
     <w:basedOn w:val="Normal"/>
     <w:uiPriority w:val="99"/>
-    <w:semiHidden/>
     <w:unhideWhenUsed/>
     <w:rsid w:val="00C903AD"/>
     <w:rPr>
       <w:rFonts w:ascii="Times New Roman" w:hAnsi="Times New Roman" w:cs="Times New Roman"/>
+    </w:rPr>
+  </w:style>
+  <w:style w:type="character" w:styleId="HTMLCode">
+    <w:name w:val="HTML Code"/>
+    <w:basedOn w:val="DefaultParagraphFont"/>
+    <w:uiPriority w:val="99"/>
+    <w:semiHidden/>
+    <w:unhideWhenUsed/>
+    <w:rsid w:val="00583BF6"/>
+    <w:rPr>
+      <w:rFonts w:ascii="Courier New" w:eastAsia="Times New Roman" w:hAnsi="Courier New" w:cs="Courier New"/>
+      <w:sz w:val="20"/>
+      <w:szCs w:val="20"/>
     </w:rPr>
   </w:style>
 </w:styles>

</xml_diff>